<commit_message>
# Teste de performance com K6 - Criando teste de transferência
Adicionando a função do helper para obtrenção de token
Criando teste de transferência
</commit_message>
<xml_diff>
--- a/Modulo_5_Testes_De_Performance/Desafio - Resumo modulo 5 - Teste de Performance - Copia.docx
+++ b/Modulo_5_Testes_De_Performance/Desafio - Resumo modulo 5 - Teste de Performance - Copia.docx
@@ -20744,6 +20744,15 @@
           <w:bCs/>
         </w:rPr>
       </w:pPr>
+    </w:p>
+    <w:p>
+      <w:pPr>
+        <w:spacing w:after="0"/>
+        <w:rPr>
+          <w:b/>
+          <w:bCs/>
+        </w:rPr>
+      </w:pPr>
       <w:r>
         <w:rPr>
           <w:b/>
@@ -21075,6 +21084,7 @@
         <w:spacing w:after="0"/>
       </w:pPr>
       <w:r>
+        <w:lastRenderedPageBreak/>
         <w:t>Os valores do tipo texto também usam aspas duplas.</w:t>
       </w:r>
     </w:p>
@@ -21087,7 +21097,6 @@
         <w:spacing w:after="0"/>
       </w:pPr>
       <w:r>
-        <w:lastRenderedPageBreak/>
         <w:t>O JSON não aceita comentários nem vírgulas sobrando no final das propriedades.</w:t>
       </w:r>
     </w:p>
@@ -21540,11 +21549,6 @@
     <w:p>
       <w:pPr>
         <w:spacing w:after="0"/>
-      </w:pPr>
-    </w:p>
-    <w:p>
-      <w:pPr>
-        <w:spacing w:after="0"/>
         <w:rPr>
           <w:b/>
           <w:bCs/>
@@ -22014,7 +22018,10 @@
     </w:p>
     <w:p>
       <w:pPr>
-        <w:spacing w:after="0"/>
+        <w:rPr>
+          <w:b/>
+          <w:bCs/>
+        </w:rPr>
       </w:pPr>
       <w:r>
         <w:rPr>
@@ -22037,6 +22044,2017 @@
         </w:rPr>
         <w:t xml:space="preserve">. </w:t>
       </w:r>
+      <w:r>
+        <w:rPr>
+          <w:b/>
+          <w:bCs/>
+        </w:rPr>
+        <w:t>REAPROVEITANDO CÓDIGO E USANDO O TOKEN</w:t>
+      </w:r>
+    </w:p>
+    <w:p>
+      <w:pPr>
+        <w:spacing w:after="0"/>
+        <w:rPr>
+          <w:b/>
+          <w:bCs/>
+        </w:rPr>
+      </w:pPr>
+      <w:r>
+        <w:rPr>
+          <w:b/>
+          <w:bCs/>
+        </w:rPr>
+        <w:t>1. Qual problema estamos resolvendo?</w:t>
+      </w:r>
+    </w:p>
+    <w:p>
+      <w:pPr>
+        <w:spacing w:after="0"/>
+      </w:pPr>
+    </w:p>
+    <w:p>
+      <w:pPr>
+        <w:spacing w:after="0"/>
+      </w:pPr>
+      <w:r>
+        <w:t>Para executar uma transferência, a API exige um token de autenticação, obtido por meio do login.</w:t>
+      </w:r>
+    </w:p>
+    <w:p>
+      <w:pPr>
+        <w:spacing w:after="0"/>
+      </w:pPr>
+      <w:r>
+        <w:lastRenderedPageBreak/>
+        <w:t>Uma solução ruim seria copiar o código de login para cada teste que exige autenticação. Isso gera duplicação e dificulta a manutenção.</w:t>
+      </w:r>
+    </w:p>
+    <w:p>
+      <w:pPr>
+        <w:spacing w:after="0"/>
+      </w:pPr>
+    </w:p>
+    <w:p>
+      <w:pPr>
+        <w:spacing w:after="0"/>
+      </w:pPr>
+      <w:r>
+        <w:t xml:space="preserve">A solução é criar um </w:t>
+      </w:r>
+      <w:proofErr w:type="spellStart"/>
+      <w:r>
+        <w:t>helper</w:t>
+      </w:r>
+      <w:proofErr w:type="spellEnd"/>
+      <w:r>
+        <w:t xml:space="preserve"> que centraliza a obtenção do token.</w:t>
+      </w:r>
+    </w:p>
+    <w:p>
+      <w:pPr>
+        <w:spacing w:after="0"/>
+      </w:pPr>
+    </w:p>
+    <w:p>
+      <w:pPr>
+        <w:spacing w:after="0"/>
+        <w:rPr>
+          <w:b/>
+          <w:bCs/>
+        </w:rPr>
+      </w:pPr>
+      <w:r>
+        <w:rPr>
+          <w:noProof/>
+        </w:rPr>
+        <w:drawing>
+          <wp:inline distT="0" distB="0" distL="0" distR="0" wp14:anchorId="3CACA3AA" wp14:editId="3293CF4C">
+            <wp:extent cx="6645910" cy="2049145"/>
+            <wp:effectExtent l="0" t="0" r="2540" b="8255"/>
+            <wp:docPr id="726583238" name="Imagem 1"/>
+            <wp:cNvGraphicFramePr>
+              <a:graphicFrameLocks xmlns:a="http://schemas.openxmlformats.org/drawingml/2006/main" noChangeAspect="1"/>
+            </wp:cNvGraphicFramePr>
+            <a:graphic xmlns:a="http://schemas.openxmlformats.org/drawingml/2006/main">
+              <a:graphicData uri="http://schemas.openxmlformats.org/drawingml/2006/picture">
+                <pic:pic xmlns:pic="http://schemas.openxmlformats.org/drawingml/2006/picture">
+                  <pic:nvPicPr>
+                    <pic:cNvPr id="726583238" name=""/>
+                    <pic:cNvPicPr/>
+                  </pic:nvPicPr>
+                  <pic:blipFill>
+                    <a:blip r:embed="rId29"/>
+                    <a:stretch>
+                      <a:fillRect/>
+                    </a:stretch>
+                  </pic:blipFill>
+                  <pic:spPr>
+                    <a:xfrm>
+                      <a:off x="0" y="0"/>
+                      <a:ext cx="6645910" cy="2049145"/>
+                    </a:xfrm>
+                    <a:prstGeom prst="rect">
+                      <a:avLst/>
+                    </a:prstGeom>
+                  </pic:spPr>
+                </pic:pic>
+              </a:graphicData>
+            </a:graphic>
+          </wp:inline>
+        </w:drawing>
+      </w:r>
+    </w:p>
+    <w:p>
+      <w:pPr>
+        <w:spacing w:after="0"/>
+        <w:rPr>
+          <w:b/>
+          <w:bCs/>
+        </w:rPr>
+      </w:pPr>
+    </w:p>
+    <w:p>
+      <w:pPr>
+        <w:spacing w:after="0"/>
+        <w:rPr>
+          <w:b/>
+          <w:bCs/>
+        </w:rPr>
+      </w:pPr>
+      <w:r>
+        <w:rPr>
+          <w:b/>
+          <w:bCs/>
+        </w:rPr>
+        <w:t>2. Estrutura do projeto</w:t>
+      </w:r>
+    </w:p>
+    <w:p>
+      <w:pPr>
+        <w:spacing w:after="0"/>
+      </w:pPr>
+    </w:p>
+    <w:p>
+      <w:pPr>
+        <w:spacing w:after="0"/>
+      </w:pPr>
+      <w:r>
+        <w:t>Ao final da aula, a estrutura deverá ficar semelhante a esta:</w:t>
+      </w:r>
+    </w:p>
+    <w:p>
+      <w:pPr>
+        <w:spacing w:after="0"/>
+      </w:pPr>
+    </w:p>
+    <w:p>
+      <w:pPr>
+        <w:spacing w:after="0"/>
+      </w:pPr>
+      <w:r>
+        <w:rPr>
+          <w:noProof/>
+        </w:rPr>
+        <w:drawing>
+          <wp:inline distT="0" distB="0" distL="0" distR="0" wp14:anchorId="78707313" wp14:editId="146521A8">
+            <wp:extent cx="6645910" cy="1980565"/>
+            <wp:effectExtent l="0" t="0" r="2540" b="635"/>
+            <wp:docPr id="592659944" name="Imagem 1"/>
+            <wp:cNvGraphicFramePr>
+              <a:graphicFrameLocks xmlns:a="http://schemas.openxmlformats.org/drawingml/2006/main" noChangeAspect="1"/>
+            </wp:cNvGraphicFramePr>
+            <a:graphic xmlns:a="http://schemas.openxmlformats.org/drawingml/2006/main">
+              <a:graphicData uri="http://schemas.openxmlformats.org/drawingml/2006/picture">
+                <pic:pic xmlns:pic="http://schemas.openxmlformats.org/drawingml/2006/picture">
+                  <pic:nvPicPr>
+                    <pic:cNvPr id="592659944" name=""/>
+                    <pic:cNvPicPr/>
+                  </pic:nvPicPr>
+                  <pic:blipFill>
+                    <a:blip r:embed="rId30"/>
+                    <a:stretch>
+                      <a:fillRect/>
+                    </a:stretch>
+                  </pic:blipFill>
+                  <pic:spPr>
+                    <a:xfrm>
+                      <a:off x="0" y="0"/>
+                      <a:ext cx="6645910" cy="1980565"/>
+                    </a:xfrm>
+                    <a:prstGeom prst="rect">
+                      <a:avLst/>
+                    </a:prstGeom>
+                  </pic:spPr>
+                </pic:pic>
+              </a:graphicData>
+            </a:graphic>
+          </wp:inline>
+        </w:drawing>
+      </w:r>
+    </w:p>
+    <w:p>
+      <w:pPr>
+        <w:spacing w:after="0"/>
+      </w:pPr>
+    </w:p>
+    <w:p>
+      <w:pPr>
+        <w:spacing w:after="0"/>
+      </w:pPr>
+      <w:r>
+        <w:t xml:space="preserve">Observe que </w:t>
+      </w:r>
+      <w:proofErr w:type="spellStart"/>
+      <w:r>
+        <w:t>helpers</w:t>
+      </w:r>
+      <w:proofErr w:type="spellEnd"/>
+      <w:r>
+        <w:t xml:space="preserve"> fica na raiz do projeto, no mesmo nível de </w:t>
+      </w:r>
+      <w:proofErr w:type="spellStart"/>
+      <w:r>
+        <w:t>fixtures</w:t>
+      </w:r>
+      <w:proofErr w:type="spellEnd"/>
+      <w:r>
+        <w:t xml:space="preserve"> e </w:t>
+      </w:r>
+      <w:proofErr w:type="spellStart"/>
+      <w:r>
+        <w:t>tests</w:t>
+      </w:r>
+      <w:proofErr w:type="spellEnd"/>
+      <w:r>
+        <w:t>.</w:t>
+      </w:r>
+    </w:p>
+    <w:p>
+      <w:pPr>
+        <w:spacing w:after="0"/>
+        <w:rPr>
+          <w:b/>
+          <w:bCs/>
+        </w:rPr>
+      </w:pPr>
+    </w:p>
+    <w:p>
+      <w:pPr>
+        <w:spacing w:after="0"/>
+        <w:rPr>
+          <w:b/>
+          <w:bCs/>
+        </w:rPr>
+      </w:pPr>
+      <w:r>
+        <w:rPr>
+          <w:b/>
+          <w:bCs/>
+        </w:rPr>
+        <w:t xml:space="preserve">3. Criando o </w:t>
+      </w:r>
+      <w:proofErr w:type="spellStart"/>
+      <w:r>
+        <w:rPr>
+          <w:b/>
+          <w:bCs/>
+        </w:rPr>
+        <w:t>helper</w:t>
+      </w:r>
+      <w:proofErr w:type="spellEnd"/>
+      <w:r>
+        <w:rPr>
+          <w:b/>
+          <w:bCs/>
+        </w:rPr>
+        <w:t xml:space="preserve"> de autenticação</w:t>
+      </w:r>
+    </w:p>
+    <w:p>
+      <w:pPr>
+        <w:spacing w:after="0"/>
+      </w:pPr>
+    </w:p>
+    <w:p>
+      <w:pPr>
+        <w:spacing w:after="0"/>
+      </w:pPr>
+      <w:r>
+        <w:t xml:space="preserve">No arquivo </w:t>
+      </w:r>
+      <w:proofErr w:type="spellStart"/>
+      <w:r>
+        <w:t>helpers</w:t>
+      </w:r>
+      <w:proofErr w:type="spellEnd"/>
+      <w:r>
+        <w:t>/autenticacao.js, a lógica é:</w:t>
+      </w:r>
+    </w:p>
+    <w:p>
+      <w:pPr>
+        <w:numPr>
+          <w:ilvl w:val="0"/>
+          <w:numId w:val="57"/>
+        </w:numPr>
+        <w:spacing w:after="0"/>
+      </w:pPr>
+      <w:r>
+        <w:t>Importar o módulo HTTP do k6.</w:t>
+      </w:r>
+    </w:p>
+    <w:p>
+      <w:pPr>
+        <w:numPr>
+          <w:ilvl w:val="0"/>
+          <w:numId w:val="57"/>
+        </w:numPr>
+        <w:spacing w:after="0"/>
+      </w:pPr>
+      <w:r>
+        <w:t>Carregar os dados do login pelo arquivo JSON.</w:t>
+      </w:r>
+    </w:p>
+    <w:p>
+      <w:pPr>
+        <w:numPr>
+          <w:ilvl w:val="0"/>
+          <w:numId w:val="57"/>
+        </w:numPr>
+        <w:spacing w:after="0"/>
+      </w:pPr>
+      <w:r>
+        <w:t xml:space="preserve">Enviar a requisição para o </w:t>
+      </w:r>
+      <w:proofErr w:type="spellStart"/>
+      <w:r>
+        <w:t>endpoint</w:t>
+      </w:r>
+      <w:proofErr w:type="spellEnd"/>
+      <w:r>
+        <w:t xml:space="preserve"> de login.</w:t>
+      </w:r>
+    </w:p>
+    <w:p>
+      <w:pPr>
+        <w:numPr>
+          <w:ilvl w:val="0"/>
+          <w:numId w:val="57"/>
+        </w:numPr>
+        <w:spacing w:after="0"/>
+      </w:pPr>
+      <w:r>
+        <w:t>Extrair o token da resposta.</w:t>
+      </w:r>
+    </w:p>
+    <w:p>
+      <w:pPr>
+        <w:numPr>
+          <w:ilvl w:val="0"/>
+          <w:numId w:val="57"/>
+        </w:numPr>
+        <w:spacing w:after="0"/>
+      </w:pPr>
+      <w:r>
+        <w:t>Retornar somente o token.</w:t>
+      </w:r>
+    </w:p>
+    <w:p>
+      <w:pPr>
+        <w:spacing w:after="0"/>
+      </w:pPr>
+    </w:p>
+    <w:p>
+      <w:r>
+        <w:br w:type="page"/>
+      </w:r>
+    </w:p>
+    <w:p>
+      <w:pPr>
+        <w:spacing w:after="0"/>
+      </w:pPr>
+      <w:r>
+        <w:lastRenderedPageBreak/>
+        <w:t>Exemplo:</w:t>
+      </w:r>
+    </w:p>
+    <w:p>
+      <w:pPr>
+        <w:spacing w:after="0"/>
+      </w:pPr>
+    </w:p>
+    <w:p>
+      <w:pPr>
+        <w:spacing w:after="0"/>
+      </w:pPr>
+    </w:p>
+    <w:p>
+      <w:pPr>
+        <w:spacing w:after="0"/>
+      </w:pPr>
+      <w:proofErr w:type="spellStart"/>
+      <w:r>
+        <w:t>import</w:t>
+      </w:r>
+      <w:proofErr w:type="spellEnd"/>
+      <w:r>
+        <w:t xml:space="preserve"> http </w:t>
+      </w:r>
+      <w:proofErr w:type="spellStart"/>
+      <w:r>
+        <w:t>from</w:t>
+      </w:r>
+      <w:proofErr w:type="spellEnd"/>
+      <w:r>
+        <w:t xml:space="preserve"> 'k6/http';</w:t>
+      </w:r>
+    </w:p>
+    <w:p>
+      <w:pPr>
+        <w:spacing w:after="0"/>
+      </w:pPr>
+    </w:p>
+    <w:p>
+      <w:pPr>
+        <w:spacing w:after="0"/>
+      </w:pPr>
+      <w:proofErr w:type="spellStart"/>
+      <w:r>
+        <w:t>const</w:t>
+      </w:r>
+      <w:proofErr w:type="spellEnd"/>
+      <w:r>
+        <w:t xml:space="preserve"> </w:t>
+      </w:r>
+      <w:proofErr w:type="spellStart"/>
+      <w:r>
+        <w:t>postLogin</w:t>
+      </w:r>
+      <w:proofErr w:type="spellEnd"/>
+      <w:r>
+        <w:t xml:space="preserve"> = </w:t>
+      </w:r>
+      <w:proofErr w:type="spellStart"/>
+      <w:r>
+        <w:t>JSON.parse</w:t>
+      </w:r>
+      <w:proofErr w:type="spellEnd"/>
+      <w:r>
+        <w:t>(open('../</w:t>
+      </w:r>
+      <w:proofErr w:type="spellStart"/>
+      <w:r>
+        <w:t>fixtures</w:t>
+      </w:r>
+      <w:proofErr w:type="spellEnd"/>
+      <w:r>
+        <w:t>/</w:t>
+      </w:r>
+      <w:proofErr w:type="spellStart"/>
+      <w:r>
+        <w:t>postLogin.json</w:t>
+      </w:r>
+      <w:proofErr w:type="spellEnd"/>
+      <w:r>
+        <w:t>'));</w:t>
+      </w:r>
+    </w:p>
+    <w:p>
+      <w:pPr>
+        <w:spacing w:after="0"/>
+      </w:pPr>
+    </w:p>
+    <w:p>
+      <w:pPr>
+        <w:spacing w:after="0"/>
+      </w:pPr>
+      <w:proofErr w:type="spellStart"/>
+      <w:r>
+        <w:t>export</w:t>
+      </w:r>
+      <w:proofErr w:type="spellEnd"/>
+      <w:r>
+        <w:t xml:space="preserve"> </w:t>
+      </w:r>
+      <w:proofErr w:type="spellStart"/>
+      <w:r>
+        <w:t>function</w:t>
+      </w:r>
+      <w:proofErr w:type="spellEnd"/>
+      <w:r>
+        <w:t xml:space="preserve"> </w:t>
+      </w:r>
+      <w:proofErr w:type="spellStart"/>
+      <w:proofErr w:type="gramStart"/>
+      <w:r>
+        <w:t>obterToken</w:t>
+      </w:r>
+      <w:proofErr w:type="spellEnd"/>
+      <w:r>
+        <w:t>(</w:t>
+      </w:r>
+      <w:proofErr w:type="gramEnd"/>
+      <w:r>
+        <w:t>) {</w:t>
+      </w:r>
+    </w:p>
+    <w:p>
+      <w:pPr>
+        <w:spacing w:after="0"/>
+      </w:pPr>
+      <w:r>
+        <w:t xml:space="preserve">    </w:t>
+      </w:r>
+      <w:proofErr w:type="spellStart"/>
+      <w:r>
+        <w:t>const</w:t>
+      </w:r>
+      <w:proofErr w:type="spellEnd"/>
+      <w:r>
+        <w:t xml:space="preserve"> </w:t>
+      </w:r>
+      <w:proofErr w:type="spellStart"/>
+      <w:r>
+        <w:t>url</w:t>
+      </w:r>
+      <w:proofErr w:type="spellEnd"/>
+      <w:r>
+        <w:t xml:space="preserve"> = 'http://localhost:3000/login';</w:t>
+      </w:r>
+    </w:p>
+    <w:p>
+      <w:pPr>
+        <w:spacing w:after="0"/>
+      </w:pPr>
+    </w:p>
+    <w:p>
+      <w:pPr>
+        <w:spacing w:after="0"/>
+      </w:pPr>
+      <w:r>
+        <w:t xml:space="preserve">    </w:t>
+      </w:r>
+      <w:proofErr w:type="spellStart"/>
+      <w:r>
+        <w:t>const</w:t>
+      </w:r>
+      <w:proofErr w:type="spellEnd"/>
+      <w:r>
+        <w:t xml:space="preserve"> </w:t>
+      </w:r>
+      <w:proofErr w:type="spellStart"/>
+      <w:r>
+        <w:t>params</w:t>
+      </w:r>
+      <w:proofErr w:type="spellEnd"/>
+      <w:r>
+        <w:t xml:space="preserve"> = {</w:t>
+      </w:r>
+    </w:p>
+    <w:p>
+      <w:pPr>
+        <w:spacing w:after="0"/>
+      </w:pPr>
+      <w:r>
+        <w:t xml:space="preserve">        </w:t>
+      </w:r>
+      <w:proofErr w:type="spellStart"/>
+      <w:r>
+        <w:t>headers</w:t>
+      </w:r>
+      <w:proofErr w:type="spellEnd"/>
+      <w:r>
+        <w:t>: {</w:t>
+      </w:r>
+    </w:p>
+    <w:p>
+      <w:pPr>
+        <w:spacing w:after="0"/>
+      </w:pPr>
+      <w:r>
+        <w:t xml:space="preserve">            '</w:t>
+      </w:r>
+      <w:proofErr w:type="spellStart"/>
+      <w:r>
+        <w:t>Content-Type</w:t>
+      </w:r>
+      <w:proofErr w:type="spellEnd"/>
+      <w:r>
+        <w:t>': '</w:t>
+      </w:r>
+      <w:proofErr w:type="spellStart"/>
+      <w:r>
+        <w:t>application</w:t>
+      </w:r>
+      <w:proofErr w:type="spellEnd"/>
+      <w:r>
+        <w:t>/</w:t>
+      </w:r>
+      <w:proofErr w:type="spellStart"/>
+      <w:r>
+        <w:t>json</w:t>
+      </w:r>
+      <w:proofErr w:type="spellEnd"/>
+      <w:r>
+        <w:t>',</w:t>
+      </w:r>
+    </w:p>
+    <w:p>
+      <w:pPr>
+        <w:spacing w:after="0"/>
+      </w:pPr>
+      <w:r>
+        <w:t xml:space="preserve">        },</w:t>
+      </w:r>
+    </w:p>
+    <w:p>
+      <w:pPr>
+        <w:spacing w:after="0"/>
+      </w:pPr>
+      <w:r>
+        <w:t xml:space="preserve">    };</w:t>
+      </w:r>
+    </w:p>
+    <w:p>
+      <w:pPr>
+        <w:spacing w:after="0"/>
+      </w:pPr>
+    </w:p>
+    <w:p>
+      <w:pPr>
+        <w:spacing w:after="0"/>
+      </w:pPr>
+      <w:r>
+        <w:t xml:space="preserve">    </w:t>
+      </w:r>
+      <w:proofErr w:type="spellStart"/>
+      <w:r>
+        <w:t>const</w:t>
+      </w:r>
+      <w:proofErr w:type="spellEnd"/>
+      <w:r>
+        <w:t xml:space="preserve"> resposta = </w:t>
+      </w:r>
+      <w:proofErr w:type="spellStart"/>
+      <w:proofErr w:type="gramStart"/>
+      <w:r>
+        <w:t>http.post</w:t>
+      </w:r>
+      <w:proofErr w:type="spellEnd"/>
+      <w:r>
+        <w:t>(</w:t>
+      </w:r>
+      <w:proofErr w:type="gramEnd"/>
+    </w:p>
+    <w:p>
+      <w:pPr>
+        <w:spacing w:after="0"/>
+      </w:pPr>
+      <w:r>
+        <w:t xml:space="preserve">        </w:t>
+      </w:r>
+      <w:proofErr w:type="spellStart"/>
+      <w:r>
+        <w:t>url</w:t>
+      </w:r>
+      <w:proofErr w:type="spellEnd"/>
+      <w:r>
+        <w:t>,</w:t>
+      </w:r>
+    </w:p>
+    <w:p>
+      <w:pPr>
+        <w:spacing w:after="0"/>
+      </w:pPr>
+      <w:r>
+        <w:t xml:space="preserve">        </w:t>
+      </w:r>
+      <w:proofErr w:type="spellStart"/>
+      <w:r>
+        <w:t>JSON.stringify</w:t>
+      </w:r>
+      <w:proofErr w:type="spellEnd"/>
+      <w:r>
+        <w:t>(</w:t>
+      </w:r>
+      <w:proofErr w:type="spellStart"/>
+      <w:r>
+        <w:t>postLogin</w:t>
+      </w:r>
+      <w:proofErr w:type="spellEnd"/>
+      <w:r>
+        <w:t>),</w:t>
+      </w:r>
+    </w:p>
+    <w:p>
+      <w:pPr>
+        <w:spacing w:after="0"/>
+      </w:pPr>
+      <w:r>
+        <w:t xml:space="preserve">        </w:t>
+      </w:r>
+      <w:proofErr w:type="spellStart"/>
+      <w:r>
+        <w:t>params</w:t>
+      </w:r>
+      <w:proofErr w:type="spellEnd"/>
+    </w:p>
+    <w:p>
+      <w:pPr>
+        <w:spacing w:after="0"/>
+      </w:pPr>
+      <w:r>
+        <w:t xml:space="preserve">    );</w:t>
+      </w:r>
+    </w:p>
+    <w:p>
+      <w:pPr>
+        <w:spacing w:after="0"/>
+      </w:pPr>
+    </w:p>
+    <w:p>
+      <w:pPr>
+        <w:spacing w:after="0"/>
+      </w:pPr>
+      <w:r>
+        <w:t xml:space="preserve">    </w:t>
+      </w:r>
+      <w:proofErr w:type="spellStart"/>
+      <w:r>
+        <w:t>return</w:t>
+      </w:r>
+      <w:proofErr w:type="spellEnd"/>
+      <w:r>
+        <w:t xml:space="preserve"> </w:t>
+      </w:r>
+      <w:proofErr w:type="spellStart"/>
+      <w:proofErr w:type="gramStart"/>
+      <w:r>
+        <w:t>resposta.json</w:t>
+      </w:r>
+      <w:proofErr w:type="spellEnd"/>
+      <w:proofErr w:type="gramEnd"/>
+      <w:r>
+        <w:t>('token');</w:t>
+      </w:r>
+    </w:p>
+    <w:p>
+      <w:pPr>
+        <w:spacing w:after="0"/>
+      </w:pPr>
+      <w:r>
+        <w:t>}</w:t>
+      </w:r>
+    </w:p>
+    <w:p>
+      <w:pPr>
+        <w:spacing w:after="0"/>
+      </w:pPr>
+    </w:p>
+    <w:p>
+      <w:pPr>
+        <w:spacing w:after="0"/>
+      </w:pPr>
+      <w:r>
+        <w:t xml:space="preserve">Esse exemplo pressupõe que o </w:t>
+      </w:r>
+      <w:proofErr w:type="spellStart"/>
+      <w:r>
+        <w:t>endpoint</w:t>
+      </w:r>
+      <w:proofErr w:type="spellEnd"/>
+      <w:r>
+        <w:t xml:space="preserve"> de login retorna HTTP 200 e um campo token na raiz do JSON, conforme explicado na aula. Se o </w:t>
+      </w:r>
+      <w:proofErr w:type="spellStart"/>
+      <w:r>
+        <w:t>helper</w:t>
+      </w:r>
+      <w:proofErr w:type="spellEnd"/>
+      <w:r>
+        <w:t xml:space="preserve"> do seu projeto já existe, compare-o com esse exemplo antes de substituir qualquer código.</w:t>
+      </w:r>
+    </w:p>
+    <w:p>
+      <w:pPr>
+        <w:spacing w:after="0"/>
+        <w:rPr>
+          <w:b/>
+          <w:bCs/>
+        </w:rPr>
+      </w:pPr>
+    </w:p>
+    <w:p>
+      <w:pPr>
+        <w:spacing w:after="0"/>
+        <w:rPr>
+          <w:b/>
+          <w:bCs/>
+        </w:rPr>
+      </w:pPr>
+      <w:r>
+        <w:rPr>
+          <w:b/>
+          <w:bCs/>
+        </w:rPr>
+        <w:t>Entenda a linha principal</w:t>
+      </w:r>
+    </w:p>
+    <w:p>
+      <w:pPr>
+        <w:spacing w:after="0"/>
+      </w:pPr>
+      <w:r>
+        <w:rPr>
+          <w:noProof/>
+        </w:rPr>
+        <w:drawing>
+          <wp:inline distT="0" distB="0" distL="0" distR="0" wp14:anchorId="1CD4B0FC" wp14:editId="36830558">
+            <wp:extent cx="6645910" cy="796925"/>
+            <wp:effectExtent l="0" t="0" r="2540" b="3175"/>
+            <wp:docPr id="1405081602" name="Imagem 1"/>
+            <wp:cNvGraphicFramePr>
+              <a:graphicFrameLocks xmlns:a="http://schemas.openxmlformats.org/drawingml/2006/main" noChangeAspect="1"/>
+            </wp:cNvGraphicFramePr>
+            <a:graphic xmlns:a="http://schemas.openxmlformats.org/drawingml/2006/main">
+              <a:graphicData uri="http://schemas.openxmlformats.org/drawingml/2006/picture">
+                <pic:pic xmlns:pic="http://schemas.openxmlformats.org/drawingml/2006/picture">
+                  <pic:nvPicPr>
+                    <pic:cNvPr id="1405081602" name=""/>
+                    <pic:cNvPicPr/>
+                  </pic:nvPicPr>
+                  <pic:blipFill>
+                    <a:blip r:embed="rId31"/>
+                    <a:stretch>
+                      <a:fillRect/>
+                    </a:stretch>
+                  </pic:blipFill>
+                  <pic:spPr>
+                    <a:xfrm>
+                      <a:off x="0" y="0"/>
+                      <a:ext cx="6645910" cy="796925"/>
+                    </a:xfrm>
+                    <a:prstGeom prst="rect">
+                      <a:avLst/>
+                    </a:prstGeom>
+                  </pic:spPr>
+                </pic:pic>
+              </a:graphicData>
+            </a:graphic>
+          </wp:inline>
+        </w:drawing>
+      </w:r>
+    </w:p>
+    <w:p>
+      <w:pPr>
+        <w:spacing w:after="0"/>
+      </w:pPr>
+    </w:p>
+    <w:p>
+      <w:pPr>
+        <w:pStyle w:val="PargrafodaLista"/>
+        <w:numPr>
+          <w:ilvl w:val="0"/>
+          <w:numId w:val="60"/>
+        </w:numPr>
+        <w:spacing w:after="0"/>
+      </w:pPr>
+      <w:r>
+        <w:t>resposta é o resultado da requisição HTTP.</w:t>
+      </w:r>
+    </w:p>
+    <w:p>
+      <w:pPr>
+        <w:numPr>
+          <w:ilvl w:val="0"/>
+          <w:numId w:val="58"/>
+        </w:numPr>
+        <w:spacing w:after="0"/>
+      </w:pPr>
+      <w:proofErr w:type="gramStart"/>
+      <w:r>
+        <w:t>.</w:t>
+      </w:r>
+      <w:proofErr w:type="spellStart"/>
+      <w:r>
+        <w:t>json</w:t>
+      </w:r>
+      <w:proofErr w:type="spellEnd"/>
+      <w:proofErr w:type="gramEnd"/>
+      <w:r>
+        <w:t>('token') extrai o campo token do corpo JSON.</w:t>
+      </w:r>
+    </w:p>
+    <w:p>
+      <w:pPr>
+        <w:numPr>
+          <w:ilvl w:val="0"/>
+          <w:numId w:val="58"/>
+        </w:numPr>
+        <w:spacing w:after="0"/>
+      </w:pPr>
+      <w:proofErr w:type="spellStart"/>
+      <w:r>
+        <w:t>return</w:t>
+      </w:r>
+      <w:proofErr w:type="spellEnd"/>
+      <w:r>
+        <w:t xml:space="preserve"> devolve esse valor para quem chamou a função.</w:t>
+      </w:r>
+    </w:p>
+    <w:p>
+      <w:pPr>
+        <w:spacing w:after="0"/>
+      </w:pPr>
+    </w:p>
+    <w:p>
+      <w:pPr>
+        <w:spacing w:after="0"/>
+      </w:pPr>
+      <w:r>
+        <w:t>Assim, o teste recebe o token sem precisar repetir o código de autenticação.</w:t>
+      </w:r>
+    </w:p>
+    <w:p>
+      <w:pPr>
+        <w:spacing w:after="0"/>
+        <w:rPr>
+          <w:b/>
+          <w:bCs/>
+        </w:rPr>
+      </w:pPr>
+    </w:p>
+    <w:p>
+      <w:pPr>
+        <w:spacing w:after="0"/>
+        <w:rPr>
+          <w:b/>
+          <w:bCs/>
+        </w:rPr>
+      </w:pPr>
+      <w:r>
+        <w:rPr>
+          <w:b/>
+          <w:bCs/>
+        </w:rPr>
+        <w:t xml:space="preserve">4. Utilizando o </w:t>
+      </w:r>
+      <w:proofErr w:type="spellStart"/>
+      <w:r>
+        <w:rPr>
+          <w:b/>
+          <w:bCs/>
+        </w:rPr>
+        <w:t>helper</w:t>
+      </w:r>
+      <w:proofErr w:type="spellEnd"/>
+      <w:r>
+        <w:rPr>
+          <w:b/>
+          <w:bCs/>
+        </w:rPr>
+        <w:t xml:space="preserve"> no teste de transferência</w:t>
+      </w:r>
+    </w:p>
+    <w:p>
+      <w:pPr>
+        <w:spacing w:after="0"/>
+      </w:pPr>
+    </w:p>
+    <w:p>
+      <w:pPr>
+        <w:spacing w:after="0"/>
+      </w:pPr>
+      <w:r>
+        <w:t xml:space="preserve">No arquivo </w:t>
+      </w:r>
+      <w:proofErr w:type="spellStart"/>
+      <w:r>
+        <w:t>tests</w:t>
+      </w:r>
+      <w:proofErr w:type="spellEnd"/>
+      <w:r>
+        <w:t>/transferencias.test.js, importamos a função:</w:t>
+      </w:r>
+    </w:p>
+    <w:p>
+      <w:pPr>
+        <w:spacing w:after="0"/>
+      </w:pPr>
+      <w:r>
+        <w:rPr>
+          <w:noProof/>
+        </w:rPr>
+        <w:lastRenderedPageBreak/>
+        <w:drawing>
+          <wp:inline distT="0" distB="0" distL="0" distR="0" wp14:anchorId="3780BD3C" wp14:editId="023F29E8">
+            <wp:extent cx="6645910" cy="742950"/>
+            <wp:effectExtent l="0" t="0" r="2540" b="0"/>
+            <wp:docPr id="2063191710" name="Imagem 1"/>
+            <wp:cNvGraphicFramePr>
+              <a:graphicFrameLocks xmlns:a="http://schemas.openxmlformats.org/drawingml/2006/main" noChangeAspect="1"/>
+            </wp:cNvGraphicFramePr>
+            <a:graphic xmlns:a="http://schemas.openxmlformats.org/drawingml/2006/main">
+              <a:graphicData uri="http://schemas.openxmlformats.org/drawingml/2006/picture">
+                <pic:pic xmlns:pic="http://schemas.openxmlformats.org/drawingml/2006/picture">
+                  <pic:nvPicPr>
+                    <pic:cNvPr id="2063191710" name=""/>
+                    <pic:cNvPicPr/>
+                  </pic:nvPicPr>
+                  <pic:blipFill>
+                    <a:blip r:embed="rId32"/>
+                    <a:stretch>
+                      <a:fillRect/>
+                    </a:stretch>
+                  </pic:blipFill>
+                  <pic:spPr>
+                    <a:xfrm>
+                      <a:off x="0" y="0"/>
+                      <a:ext cx="6645910" cy="742950"/>
+                    </a:xfrm>
+                    <a:prstGeom prst="rect">
+                      <a:avLst/>
+                    </a:prstGeom>
+                  </pic:spPr>
+                </pic:pic>
+              </a:graphicData>
+            </a:graphic>
+          </wp:inline>
+        </w:drawing>
+      </w:r>
+    </w:p>
+    <w:p>
+      <w:pPr>
+        <w:spacing w:after="0"/>
+      </w:pPr>
+    </w:p>
+    <w:p>
+      <w:pPr>
+        <w:spacing w:after="0"/>
+      </w:pPr>
+      <w:r>
+        <w:t>Em seguida, chamamos a função e usamos o valor retornado no cabeçalho:</w:t>
+      </w:r>
+    </w:p>
+    <w:p>
+      <w:pPr>
+        <w:spacing w:after="0"/>
+      </w:pPr>
+    </w:p>
+    <w:p>
+      <w:pPr>
+        <w:spacing w:after="0"/>
+      </w:pPr>
+      <w:r>
+        <w:rPr>
+          <w:noProof/>
+        </w:rPr>
+        <w:drawing>
+          <wp:inline distT="0" distB="0" distL="0" distR="0" wp14:anchorId="277CDE42" wp14:editId="255D97E6">
+            <wp:extent cx="6645910" cy="2021205"/>
+            <wp:effectExtent l="0" t="0" r="2540" b="0"/>
+            <wp:docPr id="1647729865" name="Imagem 1"/>
+            <wp:cNvGraphicFramePr>
+              <a:graphicFrameLocks xmlns:a="http://schemas.openxmlformats.org/drawingml/2006/main" noChangeAspect="1"/>
+            </wp:cNvGraphicFramePr>
+            <a:graphic xmlns:a="http://schemas.openxmlformats.org/drawingml/2006/main">
+              <a:graphicData uri="http://schemas.openxmlformats.org/drawingml/2006/picture">
+                <pic:pic xmlns:pic="http://schemas.openxmlformats.org/drawingml/2006/picture">
+                  <pic:nvPicPr>
+                    <pic:cNvPr id="1647729865" name=""/>
+                    <pic:cNvPicPr/>
+                  </pic:nvPicPr>
+                  <pic:blipFill>
+                    <a:blip r:embed="rId33"/>
+                    <a:stretch>
+                      <a:fillRect/>
+                    </a:stretch>
+                  </pic:blipFill>
+                  <pic:spPr>
+                    <a:xfrm>
+                      <a:off x="0" y="0"/>
+                      <a:ext cx="6645910" cy="2021205"/>
+                    </a:xfrm>
+                    <a:prstGeom prst="rect">
+                      <a:avLst/>
+                    </a:prstGeom>
+                  </pic:spPr>
+                </pic:pic>
+              </a:graphicData>
+            </a:graphic>
+          </wp:inline>
+        </w:drawing>
+      </w:r>
+    </w:p>
+    <w:p>
+      <w:pPr>
+        <w:spacing w:after="0"/>
+      </w:pPr>
+    </w:p>
+    <w:p>
+      <w:pPr>
+        <w:spacing w:after="0"/>
+      </w:pPr>
+      <w:r>
+        <w:t xml:space="preserve">O formato </w:t>
+      </w:r>
+      <w:proofErr w:type="spellStart"/>
+      <w:r>
+        <w:t>Bearer</w:t>
+      </w:r>
+      <w:proofErr w:type="spellEnd"/>
+      <w:r>
+        <w:t xml:space="preserve"> é utilizado para enviar o token de autenticação. O token não deve ser fixado no código porque pode expirar.</w:t>
+      </w:r>
+    </w:p>
+    <w:p>
+      <w:pPr>
+        <w:spacing w:after="0"/>
+      </w:pPr>
+    </w:p>
+    <w:p>
+      <w:pPr>
+        <w:spacing w:after="0"/>
+      </w:pPr>
+      <w:r>
+        <w:rPr>
+          <w:b/>
+          <w:bCs/>
+        </w:rPr>
+        <w:t>Atenção:</w:t>
+      </w:r>
+      <w:r>
+        <w:t xml:space="preserve"> confirme o status esperado no contrato da API. Na transcrição, o teste de transferência é descrito como validando HTTP 200, enquanto no seu teste anterior você validava 201. O status correto depende da implementação real do </w:t>
+      </w:r>
+      <w:proofErr w:type="spellStart"/>
+      <w:r>
+        <w:t>endpoint</w:t>
+      </w:r>
+      <w:proofErr w:type="spellEnd"/>
+      <w:r>
+        <w:t>.</w:t>
+      </w:r>
+    </w:p>
+    <w:p>
+      <w:pPr>
+        <w:spacing w:after="0"/>
+        <w:rPr>
+          <w:b/>
+          <w:bCs/>
+        </w:rPr>
+      </w:pPr>
+    </w:p>
+    <w:p>
+      <w:pPr>
+        <w:spacing w:after="0"/>
+        <w:rPr>
+          <w:b/>
+          <w:bCs/>
+        </w:rPr>
+      </w:pPr>
+      <w:r>
+        <w:rPr>
+          <w:b/>
+          <w:bCs/>
+        </w:rPr>
+        <w:t xml:space="preserve">5. Por que usar </w:t>
+      </w:r>
+      <w:proofErr w:type="spellStart"/>
+      <w:r>
+        <w:rPr>
+          <w:b/>
+          <w:bCs/>
+        </w:rPr>
+        <w:t>helpers</w:t>
+      </w:r>
+      <w:proofErr w:type="spellEnd"/>
+      <w:r>
+        <w:rPr>
+          <w:b/>
+          <w:bCs/>
+        </w:rPr>
+        <w:t>?</w:t>
+      </w:r>
+    </w:p>
+    <w:p>
+      <w:pPr>
+        <w:spacing w:after="0"/>
+        <w:rPr>
+          <w:b/>
+          <w:bCs/>
+        </w:rPr>
+      </w:pPr>
+    </w:p>
+    <w:tbl>
+      <w:tblPr>
+        <w:tblW w:w="0" w:type="auto"/>
+        <w:tblCellSpacing w:w="15" w:type="dxa"/>
+        <w:tblBorders>
+          <w:top w:val="single" w:sz="4" w:space="0" w:color="auto"/>
+          <w:left w:val="single" w:sz="4" w:space="0" w:color="auto"/>
+          <w:bottom w:val="single" w:sz="4" w:space="0" w:color="auto"/>
+          <w:right w:val="single" w:sz="4" w:space="0" w:color="auto"/>
+          <w:insideH w:val="single" w:sz="4" w:space="0" w:color="auto"/>
+          <w:insideV w:val="single" w:sz="4" w:space="0" w:color="auto"/>
+        </w:tblBorders>
+        <w:tblCellMar>
+          <w:top w:w="15" w:type="dxa"/>
+          <w:left w:w="15" w:type="dxa"/>
+          <w:bottom w:w="15" w:type="dxa"/>
+          <w:right w:w="15" w:type="dxa"/>
+        </w:tblCellMar>
+        <w:tblLook w:val="04A0" w:firstRow="1" w:lastRow="0" w:firstColumn="1" w:lastColumn="0" w:noHBand="0" w:noVBand="1"/>
+      </w:tblPr>
+      <w:tblGrid>
+        <w:gridCol w:w="2752"/>
+        <w:gridCol w:w="86"/>
+        <w:gridCol w:w="2889"/>
+      </w:tblGrid>
+      <w:tr>
+        <w:trPr>
+          <w:tblCellSpacing w:w="15" w:type="dxa"/>
+        </w:trPr>
+        <w:tc>
+          <w:tcPr>
+            <w:tcW w:w="0" w:type="auto"/>
+            <w:vAlign w:val="center"/>
+            <w:hideMark/>
+          </w:tcPr>
+          <w:p>
+            <w:pPr>
+              <w:spacing w:after="0"/>
+              <w:rPr>
+                <w:b/>
+                <w:bCs/>
+              </w:rPr>
+            </w:pPr>
+            <w:r>
+              <w:rPr>
+                <w:b/>
+                <w:bCs/>
+              </w:rPr>
+              <w:t xml:space="preserve">Sem </w:t>
+            </w:r>
+            <w:proofErr w:type="spellStart"/>
+            <w:r>
+              <w:rPr>
+                <w:b/>
+                <w:bCs/>
+              </w:rPr>
+              <w:t>helper</w:t>
+            </w:r>
+            <w:proofErr w:type="spellEnd"/>
+          </w:p>
+        </w:tc>
+        <w:tc>
+          <w:tcPr>
+            <w:tcW w:w="0" w:type="auto"/>
+          </w:tcPr>
+          <w:p>
+            <w:pPr>
+              <w:spacing w:after="0"/>
+              <w:rPr>
+                <w:b/>
+                <w:bCs/>
+              </w:rPr>
+            </w:pPr>
+          </w:p>
+        </w:tc>
+        <w:tc>
+          <w:tcPr>
+            <w:tcW w:w="0" w:type="auto"/>
+            <w:vAlign w:val="center"/>
+            <w:hideMark/>
+          </w:tcPr>
+          <w:p>
+            <w:pPr>
+              <w:spacing w:after="0"/>
+              <w:rPr>
+                <w:b/>
+                <w:bCs/>
+              </w:rPr>
+            </w:pPr>
+            <w:r>
+              <w:rPr>
+                <w:b/>
+                <w:bCs/>
+              </w:rPr>
+              <w:t xml:space="preserve">Com </w:t>
+            </w:r>
+            <w:proofErr w:type="spellStart"/>
+            <w:r>
+              <w:rPr>
+                <w:b/>
+                <w:bCs/>
+              </w:rPr>
+              <w:t>helper</w:t>
+            </w:r>
+            <w:proofErr w:type="spellEnd"/>
+          </w:p>
+        </w:tc>
+      </w:tr>
+      <w:tr>
+        <w:trPr>
+          <w:tblCellSpacing w:w="15" w:type="dxa"/>
+        </w:trPr>
+        <w:tc>
+          <w:tcPr>
+            <w:tcW w:w="0" w:type="auto"/>
+            <w:vAlign w:val="center"/>
+            <w:hideMark/>
+          </w:tcPr>
+          <w:p>
+            <w:pPr>
+              <w:spacing w:after="0"/>
+            </w:pPr>
+            <w:r>
+              <w:t>Código de login duplicado</w:t>
+            </w:r>
+          </w:p>
+        </w:tc>
+        <w:tc>
+          <w:tcPr>
+            <w:tcW w:w="0" w:type="auto"/>
+          </w:tcPr>
+          <w:p>
+            <w:pPr>
+              <w:spacing w:after="0"/>
+            </w:pPr>
+          </w:p>
+        </w:tc>
+        <w:tc>
+          <w:tcPr>
+            <w:tcW w:w="0" w:type="auto"/>
+            <w:vAlign w:val="center"/>
+            <w:hideMark/>
+          </w:tcPr>
+          <w:p>
+            <w:pPr>
+              <w:spacing w:after="0"/>
+            </w:pPr>
+            <w:r>
+              <w:t>Login centralizado</w:t>
+            </w:r>
+          </w:p>
+        </w:tc>
+      </w:tr>
+      <w:tr>
+        <w:trPr>
+          <w:tblCellSpacing w:w="15" w:type="dxa"/>
+        </w:trPr>
+        <w:tc>
+          <w:tcPr>
+            <w:tcW w:w="0" w:type="auto"/>
+            <w:vAlign w:val="center"/>
+            <w:hideMark/>
+          </w:tcPr>
+          <w:p>
+            <w:pPr>
+              <w:spacing w:after="0"/>
+            </w:pPr>
+            <w:r>
+              <w:t>Alterações em vários testes</w:t>
+            </w:r>
+          </w:p>
+        </w:tc>
+        <w:tc>
+          <w:tcPr>
+            <w:tcW w:w="0" w:type="auto"/>
+          </w:tcPr>
+          <w:p>
+            <w:pPr>
+              <w:spacing w:after="0"/>
+            </w:pPr>
+          </w:p>
+        </w:tc>
+        <w:tc>
+          <w:tcPr>
+            <w:tcW w:w="0" w:type="auto"/>
+            <w:vAlign w:val="center"/>
+            <w:hideMark/>
+          </w:tcPr>
+          <w:p>
+            <w:pPr>
+              <w:spacing w:after="0"/>
+            </w:pPr>
+            <w:r>
+              <w:t>Alteração em um único lugar</w:t>
+            </w:r>
+          </w:p>
+        </w:tc>
+      </w:tr>
+      <w:tr>
+        <w:trPr>
+          <w:tblCellSpacing w:w="15" w:type="dxa"/>
+        </w:trPr>
+        <w:tc>
+          <w:tcPr>
+            <w:tcW w:w="0" w:type="auto"/>
+            <w:vAlign w:val="center"/>
+            <w:hideMark/>
+          </w:tcPr>
+          <w:p>
+            <w:pPr>
+              <w:spacing w:after="0"/>
+            </w:pPr>
+            <w:r>
+              <w:t>Mais difícil de manter</w:t>
+            </w:r>
+          </w:p>
+        </w:tc>
+        <w:tc>
+          <w:tcPr>
+            <w:tcW w:w="0" w:type="auto"/>
+          </w:tcPr>
+          <w:p>
+            <w:pPr>
+              <w:spacing w:after="0"/>
+            </w:pPr>
+          </w:p>
+        </w:tc>
+        <w:tc>
+          <w:tcPr>
+            <w:tcW w:w="0" w:type="auto"/>
+            <w:vAlign w:val="center"/>
+            <w:hideMark/>
+          </w:tcPr>
+          <w:p>
+            <w:pPr>
+              <w:spacing w:after="0"/>
+            </w:pPr>
+            <w:r>
+              <w:t>Mais fácil de reutilizar</w:t>
+            </w:r>
+          </w:p>
+        </w:tc>
+      </w:tr>
+      <w:tr>
+        <w:trPr>
+          <w:tblCellSpacing w:w="15" w:type="dxa"/>
+        </w:trPr>
+        <w:tc>
+          <w:tcPr>
+            <w:tcW w:w="0" w:type="auto"/>
+            <w:vAlign w:val="center"/>
+            <w:hideMark/>
+          </w:tcPr>
+          <w:p>
+            <w:pPr>
+              <w:spacing w:after="0"/>
+            </w:pPr>
+            <w:r>
+              <w:t>Mais repetição</w:t>
+            </w:r>
+          </w:p>
+        </w:tc>
+        <w:tc>
+          <w:tcPr>
+            <w:tcW w:w="0" w:type="auto"/>
+          </w:tcPr>
+          <w:p>
+            <w:pPr>
+              <w:spacing w:after="0"/>
+            </w:pPr>
+          </w:p>
+        </w:tc>
+        <w:tc>
+          <w:tcPr>
+            <w:tcW w:w="0" w:type="auto"/>
+            <w:vAlign w:val="center"/>
+            <w:hideMark/>
+          </w:tcPr>
+          <w:p>
+            <w:pPr>
+              <w:spacing w:after="0"/>
+            </w:pPr>
+            <w:r>
+              <w:t>Melhor organização</w:t>
+            </w:r>
+          </w:p>
+        </w:tc>
+      </w:tr>
+    </w:tbl>
+    <w:p>
+      <w:pPr>
+        <w:spacing w:after="0"/>
+      </w:pPr>
+    </w:p>
+    <w:p>
+      <w:pPr>
+        <w:spacing w:after="0"/>
+      </w:pPr>
+      <w:r>
+        <w:t xml:space="preserve">Outro ponto importante para testes de performance: cada chamada a </w:t>
+      </w:r>
+      <w:proofErr w:type="spellStart"/>
+      <w:proofErr w:type="gramStart"/>
+      <w:r>
+        <w:t>obterToken</w:t>
+      </w:r>
+      <w:proofErr w:type="spellEnd"/>
+      <w:r>
+        <w:t>(</w:t>
+      </w:r>
+      <w:proofErr w:type="gramEnd"/>
+      <w:r>
+        <w:t>) executa uma nova requisição de login. Isso deve ser considerado ao analisar as métricas, pois o tempo e a carga do login também podem entrar nos resultados globais do teste.</w:t>
+      </w:r>
+    </w:p>
+    <w:p>
+      <w:pPr>
+        <w:spacing w:after="0"/>
+        <w:rPr>
+          <w:b/>
+          <w:bCs/>
+        </w:rPr>
+      </w:pPr>
+    </w:p>
+    <w:p>
+      <w:pPr>
+        <w:spacing w:after="0"/>
+        <w:rPr>
+          <w:b/>
+          <w:bCs/>
+        </w:rPr>
+      </w:pPr>
+      <w:r>
+        <w:rPr>
+          <w:b/>
+          <w:bCs/>
+        </w:rPr>
+        <w:t>6. Executando o teste</w:t>
+      </w:r>
+    </w:p>
+    <w:p>
+      <w:pPr>
+        <w:spacing w:after="0"/>
+      </w:pPr>
+    </w:p>
+    <w:p>
+      <w:pPr>
+        <w:spacing w:after="0"/>
+      </w:pPr>
+      <w:r>
+        <w:t xml:space="preserve">No </w:t>
+      </w:r>
+      <w:proofErr w:type="spellStart"/>
+      <w:r>
+        <w:t>Git</w:t>
+      </w:r>
+      <w:proofErr w:type="spellEnd"/>
+      <w:r>
+        <w:t xml:space="preserve"> </w:t>
+      </w:r>
+      <w:proofErr w:type="spellStart"/>
+      <w:r>
+        <w:t>Bash</w:t>
+      </w:r>
+      <w:proofErr w:type="spellEnd"/>
+      <w:r>
+        <w:t>, a partir da raiz do projeto:</w:t>
+      </w:r>
+      <w:r>
+        <w:t xml:space="preserve"> </w:t>
+      </w:r>
+      <w:r>
+        <w:t xml:space="preserve">k6 </w:t>
+      </w:r>
+      <w:proofErr w:type="spellStart"/>
+      <w:r>
+        <w:t>run</w:t>
+      </w:r>
+      <w:proofErr w:type="spellEnd"/>
+      <w:r>
+        <w:t xml:space="preserve"> </w:t>
+      </w:r>
+      <w:proofErr w:type="spellStart"/>
+      <w:r>
+        <w:t>tests</w:t>
+      </w:r>
+      <w:proofErr w:type="spellEnd"/>
+      <w:r>
+        <w:t>/transferencias.test.js</w:t>
+      </w:r>
+    </w:p>
+    <w:p>
+      <w:pPr>
+        <w:spacing w:after="0"/>
+      </w:pPr>
+    </w:p>
+    <w:p>
+      <w:pPr>
+        <w:spacing w:after="0"/>
+      </w:pPr>
+      <w:r>
+        <w:t>Para usar o dashboard e tentar exportar o relatório:</w:t>
+      </w:r>
+    </w:p>
+    <w:p>
+      <w:pPr>
+        <w:spacing w:after="0"/>
+      </w:pPr>
+      <w:r>
+        <w:t>K6_WEB_DASHBOARD=</w:t>
+      </w:r>
+      <w:proofErr w:type="spellStart"/>
+      <w:r>
+        <w:t>true</w:t>
+      </w:r>
+      <w:proofErr w:type="spellEnd"/>
+      <w:r>
+        <w:t xml:space="preserve"> K6_WEB_DASHBOARD_EXPORT=html-report.html k6 </w:t>
+      </w:r>
+      <w:proofErr w:type="spellStart"/>
+      <w:r>
+        <w:t>run</w:t>
+      </w:r>
+      <w:proofErr w:type="spellEnd"/>
+      <w:r>
+        <w:t xml:space="preserve"> </w:t>
+      </w:r>
+      <w:proofErr w:type="spellStart"/>
+      <w:r>
+        <w:t>tests</w:t>
+      </w:r>
+      <w:proofErr w:type="spellEnd"/>
+      <w:r>
+        <w:t>/transferencias.test.js</w:t>
+      </w:r>
+    </w:p>
+    <w:p>
+      <w:pPr>
+        <w:spacing w:after="0"/>
+      </w:pPr>
+      <w:r>
+        <w:lastRenderedPageBreak/>
+        <w:t>Se o script tiver apenas uma iteração e terminar em cerca de um segundo, a exportação HTML poderá ser ignorada por falta de dados suficientes. Isso não significa, por si só, que o teste falhou.</w:t>
+      </w:r>
+    </w:p>
+    <w:p>
+      <w:pPr>
+        <w:spacing w:after="0"/>
+        <w:rPr>
+          <w:b/>
+          <w:bCs/>
+        </w:rPr>
+      </w:pPr>
+    </w:p>
+    <w:p>
+      <w:pPr>
+        <w:spacing w:after="0"/>
+        <w:rPr>
+          <w:b/>
+          <w:bCs/>
+        </w:rPr>
+      </w:pPr>
+      <w:r>
+        <w:rPr>
+          <w:b/>
+          <w:bCs/>
+        </w:rPr>
+        <w:t>7. V</w:t>
+      </w:r>
+      <w:proofErr w:type="spellStart"/>
+      <w:r>
+        <w:rPr>
+          <w:b/>
+          <w:bCs/>
+        </w:rPr>
+        <w:t>ersionando</w:t>
+      </w:r>
+      <w:proofErr w:type="spellEnd"/>
+      <w:r>
+        <w:rPr>
+          <w:b/>
+          <w:bCs/>
+        </w:rPr>
+        <w:t xml:space="preserve"> com </w:t>
+      </w:r>
+      <w:proofErr w:type="spellStart"/>
+      <w:r>
+        <w:rPr>
+          <w:b/>
+          <w:bCs/>
+        </w:rPr>
+        <w:t>Git</w:t>
+      </w:r>
+      <w:proofErr w:type="spellEnd"/>
+    </w:p>
+    <w:p>
+      <w:pPr>
+        <w:spacing w:after="0"/>
+      </w:pPr>
+    </w:p>
+    <w:p>
+      <w:pPr>
+        <w:spacing w:after="0"/>
+      </w:pPr>
+      <w:r>
+        <w:t>Depois de verificar o resultado:</w:t>
+      </w:r>
+    </w:p>
+    <w:p>
+      <w:pPr>
+        <w:spacing w:after="0"/>
+      </w:pPr>
+      <w:proofErr w:type="spellStart"/>
+      <w:r>
+        <w:t>git</w:t>
+      </w:r>
+      <w:proofErr w:type="spellEnd"/>
+      <w:r>
+        <w:t xml:space="preserve"> status</w:t>
+      </w:r>
+    </w:p>
+    <w:p>
+      <w:pPr>
+        <w:spacing w:after="0"/>
+      </w:pPr>
+      <w:proofErr w:type="spellStart"/>
+      <w:r>
+        <w:t>git</w:t>
+      </w:r>
+      <w:proofErr w:type="spellEnd"/>
+      <w:r>
+        <w:t xml:space="preserve"> </w:t>
+      </w:r>
+      <w:proofErr w:type="spellStart"/>
+      <w:proofErr w:type="gramStart"/>
+      <w:r>
+        <w:t>add</w:t>
+      </w:r>
+      <w:proofErr w:type="spellEnd"/>
+      <w:r>
+        <w:t xml:space="preserve"> .</w:t>
+      </w:r>
+      <w:proofErr w:type="gramEnd"/>
+    </w:p>
+    <w:p>
+      <w:pPr>
+        <w:spacing w:after="0"/>
+      </w:pPr>
+      <w:proofErr w:type="spellStart"/>
+      <w:r>
+        <w:t>git</w:t>
+      </w:r>
+      <w:proofErr w:type="spellEnd"/>
+      <w:r>
+        <w:t xml:space="preserve"> status</w:t>
+      </w:r>
+    </w:p>
+    <w:p>
+      <w:pPr>
+        <w:spacing w:after="0"/>
+      </w:pPr>
+      <w:proofErr w:type="spellStart"/>
+      <w:r>
+        <w:t>git</w:t>
+      </w:r>
+      <w:proofErr w:type="spellEnd"/>
+      <w:r>
+        <w:t xml:space="preserve"> </w:t>
+      </w:r>
+      <w:proofErr w:type="spellStart"/>
+      <w:r>
+        <w:t>commit</w:t>
+      </w:r>
+      <w:proofErr w:type="spellEnd"/>
+      <w:r>
+        <w:t xml:space="preserve"> -m "Adiciona </w:t>
+      </w:r>
+      <w:proofErr w:type="spellStart"/>
+      <w:r>
+        <w:t>helper</w:t>
+      </w:r>
+      <w:proofErr w:type="spellEnd"/>
+      <w:r>
+        <w:t xml:space="preserve"> de </w:t>
+      </w:r>
+      <w:proofErr w:type="spellStart"/>
+      <w:r>
+        <w:t>autenticacao</w:t>
+      </w:r>
+      <w:proofErr w:type="spellEnd"/>
+      <w:r>
+        <w:t xml:space="preserve"> e teste de </w:t>
+      </w:r>
+      <w:proofErr w:type="spellStart"/>
+      <w:r>
+        <w:t>transferencia</w:t>
+      </w:r>
+      <w:proofErr w:type="spellEnd"/>
+      <w:r>
+        <w:t>"</w:t>
+      </w:r>
+    </w:p>
+    <w:p>
+      <w:pPr>
+        <w:spacing w:after="0"/>
+      </w:pPr>
+      <w:proofErr w:type="spellStart"/>
+      <w:r>
+        <w:t>git</w:t>
+      </w:r>
+      <w:proofErr w:type="spellEnd"/>
+      <w:r>
+        <w:t xml:space="preserve"> </w:t>
+      </w:r>
+      <w:proofErr w:type="spellStart"/>
+      <w:r>
+        <w:t>push</w:t>
+      </w:r>
+      <w:proofErr w:type="spellEnd"/>
+      <w:r>
+        <w:t xml:space="preserve"> </w:t>
+      </w:r>
+      <w:proofErr w:type="spellStart"/>
+      <w:r>
+        <w:t>origin</w:t>
+      </w:r>
+      <w:proofErr w:type="spellEnd"/>
+      <w:r>
+        <w:t xml:space="preserve"> teste-performance</w:t>
+      </w:r>
+    </w:p>
+    <w:p>
+      <w:pPr>
+        <w:spacing w:after="0"/>
+      </w:pPr>
+      <w:r>
+        <w:t xml:space="preserve">Confira o nome da </w:t>
+      </w:r>
+      <w:proofErr w:type="spellStart"/>
+      <w:r>
+        <w:t>branch</w:t>
+      </w:r>
+      <w:proofErr w:type="spellEnd"/>
+      <w:r>
+        <w:t xml:space="preserve"> com </w:t>
+      </w:r>
+      <w:proofErr w:type="spellStart"/>
+      <w:r>
+        <w:t>git</w:t>
+      </w:r>
+      <w:proofErr w:type="spellEnd"/>
+      <w:r>
+        <w:t xml:space="preserve"> </w:t>
+      </w:r>
+      <w:proofErr w:type="spellStart"/>
+      <w:r>
+        <w:t>branch</w:t>
+      </w:r>
+      <w:proofErr w:type="spellEnd"/>
+      <w:r>
+        <w:t xml:space="preserve"> --show-</w:t>
+      </w:r>
+      <w:proofErr w:type="spellStart"/>
+      <w:r>
+        <w:t>current</w:t>
+      </w:r>
+      <w:proofErr w:type="spellEnd"/>
+      <w:r>
+        <w:t xml:space="preserve"> se tiver dúvidas.</w:t>
+      </w:r>
+    </w:p>
+    <w:p>
+      <w:pPr>
+        <w:spacing w:after="0"/>
+        <w:rPr>
+          <w:b/>
+          <w:bCs/>
+        </w:rPr>
+      </w:pPr>
+    </w:p>
+    <w:p>
+      <w:pPr>
+        <w:spacing w:after="0"/>
+        <w:rPr>
+          <w:b/>
+          <w:bCs/>
+        </w:rPr>
+      </w:pPr>
+      <w:r>
+        <w:rPr>
+          <w:b/>
+          <w:bCs/>
+        </w:rPr>
+        <w:t>O que você deve guardar desta aula</w:t>
+      </w:r>
+    </w:p>
+    <w:p>
+      <w:pPr>
+        <w:numPr>
+          <w:ilvl w:val="0"/>
+          <w:numId w:val="59"/>
+        </w:numPr>
+        <w:spacing w:after="0"/>
+      </w:pPr>
+      <w:proofErr w:type="spellStart"/>
+      <w:r>
+        <w:t>Fixture</w:t>
+      </w:r>
+      <w:proofErr w:type="spellEnd"/>
+      <w:r>
+        <w:t xml:space="preserve">: arquivo externo com dados de entrada, como </w:t>
+      </w:r>
+      <w:proofErr w:type="spellStart"/>
+      <w:r>
+        <w:t>postLogin.json</w:t>
+      </w:r>
+      <w:proofErr w:type="spellEnd"/>
+      <w:r>
+        <w:t>.</w:t>
+      </w:r>
+    </w:p>
+    <w:p>
+      <w:pPr>
+        <w:numPr>
+          <w:ilvl w:val="0"/>
+          <w:numId w:val="59"/>
+        </w:numPr>
+        <w:spacing w:after="0"/>
+      </w:pPr>
+      <w:proofErr w:type="spellStart"/>
+      <w:r>
+        <w:t>Helper</w:t>
+      </w:r>
+      <w:proofErr w:type="spellEnd"/>
+      <w:r>
+        <w:t>: função reutilizável que encapsula uma ação, como obter um token.</w:t>
+      </w:r>
+    </w:p>
+    <w:p>
+      <w:pPr>
+        <w:numPr>
+          <w:ilvl w:val="0"/>
+          <w:numId w:val="59"/>
+        </w:numPr>
+        <w:spacing w:after="0"/>
+      </w:pPr>
+      <w:r>
+        <w:t>Importação: permite usar a função auxiliar em outros arquivos.</w:t>
+      </w:r>
+    </w:p>
+    <w:p>
+      <w:pPr>
+        <w:numPr>
+          <w:ilvl w:val="0"/>
+          <w:numId w:val="59"/>
+        </w:numPr>
+        <w:spacing w:after="0"/>
+      </w:pPr>
+      <w:r>
+        <w:t xml:space="preserve">Retorno: </w:t>
+      </w:r>
+      <w:proofErr w:type="spellStart"/>
+      <w:r>
+        <w:t>return</w:t>
+      </w:r>
+      <w:proofErr w:type="spellEnd"/>
+      <w:r>
+        <w:t xml:space="preserve"> </w:t>
+      </w:r>
+      <w:proofErr w:type="spellStart"/>
+      <w:proofErr w:type="gramStart"/>
+      <w:r>
+        <w:t>resposta.json</w:t>
+      </w:r>
+      <w:proofErr w:type="spellEnd"/>
+      <w:proofErr w:type="gramEnd"/>
+      <w:r>
+        <w:t>('token') devolve apenas o token.</w:t>
+      </w:r>
+    </w:p>
+    <w:p>
+      <w:pPr>
+        <w:numPr>
+          <w:ilvl w:val="0"/>
+          <w:numId w:val="59"/>
+        </w:numPr>
+        <w:spacing w:after="0"/>
+      </w:pPr>
+      <w:r>
+        <w:t>Reutilização: evita duplicar o código de autenticação em cada teste.</w:t>
+      </w:r>
+    </w:p>
+    <w:p>
+      <w:pPr>
+        <w:spacing w:after="0"/>
+      </w:pPr>
+    </w:p>
+    <w:p>
+      <w:pPr>
+        <w:spacing w:after="0"/>
+      </w:pPr>
+      <w:r>
+        <w:t>A ideia central é construir testes menores, organizados e fáceis de manter. Essa prática também prepara seu projeto para crescer com novos cenários de API.</w:t>
+      </w:r>
+    </w:p>
+    <w:p>
+      <w:pPr>
+        <w:spacing w:after="0"/>
+      </w:pPr>
     </w:p>
     <w:p>
       <w:pPr>
@@ -22127,7 +24145,6 @@
         </w:rPr>
       </w:pPr>
       <w:r>
-        <w:lastRenderedPageBreak/>
         <w:pict w14:anchorId="017350DF">
           <v:rect id="_x0000_i1474" style="width:0;height:1.5pt" o:bullet="t" o:hrstd="t" o:hr="t" fillcolor="#a0a0a0" stroked="f"/>
         </w:pict>
@@ -23569,6 +25586,155 @@
     </w:lvl>
   </w:abstractNum>
   <w:abstractNum w:abstractNumId="9" w15:restartNumberingAfterBreak="0">
+    <w:nsid w:val="1A0432BB"/>
+    <w:multiLevelType w:val="multilevel"/>
+    <w:tmpl w:val="557C0826"/>
+    <w:lvl w:ilvl="0">
+      <w:start w:val="1"/>
+      <w:numFmt w:val="bullet"/>
+      <w:lvlText w:val=""/>
+      <w:lvlJc w:val="left"/>
+      <w:pPr>
+        <w:tabs>
+          <w:tab w:val="num" w:pos="720"/>
+        </w:tabs>
+        <w:ind w:left="720" w:hanging="360"/>
+      </w:pPr>
+      <w:rPr>
+        <w:rFonts w:ascii="Symbol" w:hAnsi="Symbol" w:hint="default"/>
+        <w:sz w:val="20"/>
+      </w:rPr>
+    </w:lvl>
+    <w:lvl w:ilvl="1" w:tentative="1">
+      <w:start w:val="1"/>
+      <w:numFmt w:val="bullet"/>
+      <w:lvlText w:val="o"/>
+      <w:lvlJc w:val="left"/>
+      <w:pPr>
+        <w:tabs>
+          <w:tab w:val="num" w:pos="1440"/>
+        </w:tabs>
+        <w:ind w:left="1440" w:hanging="360"/>
+      </w:pPr>
+      <w:rPr>
+        <w:rFonts w:ascii="Courier New" w:hAnsi="Courier New" w:hint="default"/>
+        <w:sz w:val="20"/>
+      </w:rPr>
+    </w:lvl>
+    <w:lvl w:ilvl="2" w:tentative="1">
+      <w:start w:val="1"/>
+      <w:numFmt w:val="bullet"/>
+      <w:lvlText w:val=""/>
+      <w:lvlJc w:val="left"/>
+      <w:pPr>
+        <w:tabs>
+          <w:tab w:val="num" w:pos="2160"/>
+        </w:tabs>
+        <w:ind w:left="2160" w:hanging="360"/>
+      </w:pPr>
+      <w:rPr>
+        <w:rFonts w:ascii="Wingdings" w:hAnsi="Wingdings" w:hint="default"/>
+        <w:sz w:val="20"/>
+      </w:rPr>
+    </w:lvl>
+    <w:lvl w:ilvl="3" w:tentative="1">
+      <w:start w:val="1"/>
+      <w:numFmt w:val="bullet"/>
+      <w:lvlText w:val=""/>
+      <w:lvlJc w:val="left"/>
+      <w:pPr>
+        <w:tabs>
+          <w:tab w:val="num" w:pos="2880"/>
+        </w:tabs>
+        <w:ind w:left="2880" w:hanging="360"/>
+      </w:pPr>
+      <w:rPr>
+        <w:rFonts w:ascii="Wingdings" w:hAnsi="Wingdings" w:hint="default"/>
+        <w:sz w:val="20"/>
+      </w:rPr>
+    </w:lvl>
+    <w:lvl w:ilvl="4" w:tentative="1">
+      <w:start w:val="1"/>
+      <w:numFmt w:val="bullet"/>
+      <w:lvlText w:val=""/>
+      <w:lvlJc w:val="left"/>
+      <w:pPr>
+        <w:tabs>
+          <w:tab w:val="num" w:pos="3600"/>
+        </w:tabs>
+        <w:ind w:left="3600" w:hanging="360"/>
+      </w:pPr>
+      <w:rPr>
+        <w:rFonts w:ascii="Wingdings" w:hAnsi="Wingdings" w:hint="default"/>
+        <w:sz w:val="20"/>
+      </w:rPr>
+    </w:lvl>
+    <w:lvl w:ilvl="5" w:tentative="1">
+      <w:start w:val="1"/>
+      <w:numFmt w:val="bullet"/>
+      <w:lvlText w:val=""/>
+      <w:lvlJc w:val="left"/>
+      <w:pPr>
+        <w:tabs>
+          <w:tab w:val="num" w:pos="4320"/>
+        </w:tabs>
+        <w:ind w:left="4320" w:hanging="360"/>
+      </w:pPr>
+      <w:rPr>
+        <w:rFonts w:ascii="Wingdings" w:hAnsi="Wingdings" w:hint="default"/>
+        <w:sz w:val="20"/>
+      </w:rPr>
+    </w:lvl>
+    <w:lvl w:ilvl="6" w:tentative="1">
+      <w:start w:val="1"/>
+      <w:numFmt w:val="bullet"/>
+      <w:lvlText w:val=""/>
+      <w:lvlJc w:val="left"/>
+      <w:pPr>
+        <w:tabs>
+          <w:tab w:val="num" w:pos="5040"/>
+        </w:tabs>
+        <w:ind w:left="5040" w:hanging="360"/>
+      </w:pPr>
+      <w:rPr>
+        <w:rFonts w:ascii="Wingdings" w:hAnsi="Wingdings" w:hint="default"/>
+        <w:sz w:val="20"/>
+      </w:rPr>
+    </w:lvl>
+    <w:lvl w:ilvl="7" w:tentative="1">
+      <w:start w:val="1"/>
+      <w:numFmt w:val="bullet"/>
+      <w:lvlText w:val=""/>
+      <w:lvlJc w:val="left"/>
+      <w:pPr>
+        <w:tabs>
+          <w:tab w:val="num" w:pos="5760"/>
+        </w:tabs>
+        <w:ind w:left="5760" w:hanging="360"/>
+      </w:pPr>
+      <w:rPr>
+        <w:rFonts w:ascii="Wingdings" w:hAnsi="Wingdings" w:hint="default"/>
+        <w:sz w:val="20"/>
+      </w:rPr>
+    </w:lvl>
+    <w:lvl w:ilvl="8" w:tentative="1">
+      <w:start w:val="1"/>
+      <w:numFmt w:val="bullet"/>
+      <w:lvlText w:val=""/>
+      <w:lvlJc w:val="left"/>
+      <w:pPr>
+        <w:tabs>
+          <w:tab w:val="num" w:pos="6480"/>
+        </w:tabs>
+        <w:ind w:left="6480" w:hanging="360"/>
+      </w:pPr>
+      <w:rPr>
+        <w:rFonts w:ascii="Wingdings" w:hAnsi="Wingdings" w:hint="default"/>
+        <w:sz w:val="20"/>
+      </w:rPr>
+    </w:lvl>
+  </w:abstractNum>
+  <w:abstractNum w:abstractNumId="10" w15:restartNumberingAfterBreak="0">
     <w:nsid w:val="1B5705B6"/>
     <w:multiLevelType w:val="multilevel"/>
     <w:tmpl w:val="6DB669B8"/>
@@ -23717,7 +25883,7 @@
       </w:rPr>
     </w:lvl>
   </w:abstractNum>
-  <w:abstractNum w:abstractNumId="10" w15:restartNumberingAfterBreak="0">
+  <w:abstractNum w:abstractNumId="11" w15:restartNumberingAfterBreak="0">
     <w:nsid w:val="1E2405D9"/>
     <w:multiLevelType w:val="multilevel"/>
     <w:tmpl w:val="F4808DA6"/>
@@ -23866,7 +26032,7 @@
       </w:rPr>
     </w:lvl>
   </w:abstractNum>
-  <w:abstractNum w:abstractNumId="11" w15:restartNumberingAfterBreak="0">
+  <w:abstractNum w:abstractNumId="12" w15:restartNumberingAfterBreak="0">
     <w:nsid w:val="21240B45"/>
     <w:multiLevelType w:val="multilevel"/>
     <w:tmpl w:val="1D6AC27A"/>
@@ -24015,7 +26181,7 @@
       </w:rPr>
     </w:lvl>
   </w:abstractNum>
-  <w:abstractNum w:abstractNumId="12" w15:restartNumberingAfterBreak="0">
+  <w:abstractNum w:abstractNumId="13" w15:restartNumberingAfterBreak="0">
     <w:nsid w:val="21363EB1"/>
     <w:multiLevelType w:val="multilevel"/>
     <w:tmpl w:val="9C807514"/>
@@ -24164,7 +26330,7 @@
       </w:rPr>
     </w:lvl>
   </w:abstractNum>
-  <w:abstractNum w:abstractNumId="13" w15:restartNumberingAfterBreak="0">
+  <w:abstractNum w:abstractNumId="14" w15:restartNumberingAfterBreak="0">
     <w:nsid w:val="22030D86"/>
     <w:multiLevelType w:val="multilevel"/>
     <w:tmpl w:val="1FF42270"/>
@@ -24313,7 +26479,7 @@
       </w:rPr>
     </w:lvl>
   </w:abstractNum>
-  <w:abstractNum w:abstractNumId="14" w15:restartNumberingAfterBreak="0">
+  <w:abstractNum w:abstractNumId="15" w15:restartNumberingAfterBreak="0">
     <w:nsid w:val="242F5B98"/>
     <w:multiLevelType w:val="multilevel"/>
     <w:tmpl w:val="557C0826"/>
@@ -24462,7 +26628,7 @@
       </w:rPr>
     </w:lvl>
   </w:abstractNum>
-  <w:abstractNum w:abstractNumId="15" w15:restartNumberingAfterBreak="0">
+  <w:abstractNum w:abstractNumId="16" w15:restartNumberingAfterBreak="0">
     <w:nsid w:val="28086C14"/>
     <w:multiLevelType w:val="multilevel"/>
     <w:tmpl w:val="2DDEF1FC"/>
@@ -24611,7 +26777,7 @@
       </w:rPr>
     </w:lvl>
   </w:abstractNum>
-  <w:abstractNum w:abstractNumId="16" w15:restartNumberingAfterBreak="0">
+  <w:abstractNum w:abstractNumId="17" w15:restartNumberingAfterBreak="0">
     <w:nsid w:val="2C6278E9"/>
     <w:multiLevelType w:val="multilevel"/>
     <w:tmpl w:val="AECE8362"/>
@@ -24724,7 +26890,7 @@
       </w:pPr>
     </w:lvl>
   </w:abstractNum>
-  <w:abstractNum w:abstractNumId="17" w15:restartNumberingAfterBreak="0">
+  <w:abstractNum w:abstractNumId="18" w15:restartNumberingAfterBreak="0">
     <w:nsid w:val="33766B87"/>
     <w:multiLevelType w:val="multilevel"/>
     <w:tmpl w:val="ADAADE60"/>
@@ -24873,7 +27039,7 @@
       </w:rPr>
     </w:lvl>
   </w:abstractNum>
-  <w:abstractNum w:abstractNumId="18" w15:restartNumberingAfterBreak="0">
+  <w:abstractNum w:abstractNumId="19" w15:restartNumberingAfterBreak="0">
     <w:nsid w:val="339F1E8C"/>
     <w:multiLevelType w:val="multilevel"/>
     <w:tmpl w:val="2260344A"/>
@@ -25022,7 +27188,156 @@
       </w:rPr>
     </w:lvl>
   </w:abstractNum>
-  <w:abstractNum w:abstractNumId="19" w15:restartNumberingAfterBreak="0">
+  <w:abstractNum w:abstractNumId="20" w15:restartNumberingAfterBreak="0">
+    <w:nsid w:val="35873373"/>
+    <w:multiLevelType w:val="multilevel"/>
+    <w:tmpl w:val="557C0826"/>
+    <w:lvl w:ilvl="0">
+      <w:start w:val="1"/>
+      <w:numFmt w:val="bullet"/>
+      <w:lvlText w:val=""/>
+      <w:lvlJc w:val="left"/>
+      <w:pPr>
+        <w:tabs>
+          <w:tab w:val="num" w:pos="720"/>
+        </w:tabs>
+        <w:ind w:left="720" w:hanging="360"/>
+      </w:pPr>
+      <w:rPr>
+        <w:rFonts w:ascii="Symbol" w:hAnsi="Symbol" w:hint="default"/>
+        <w:sz w:val="20"/>
+      </w:rPr>
+    </w:lvl>
+    <w:lvl w:ilvl="1" w:tentative="1">
+      <w:start w:val="1"/>
+      <w:numFmt w:val="bullet"/>
+      <w:lvlText w:val="o"/>
+      <w:lvlJc w:val="left"/>
+      <w:pPr>
+        <w:tabs>
+          <w:tab w:val="num" w:pos="1440"/>
+        </w:tabs>
+        <w:ind w:left="1440" w:hanging="360"/>
+      </w:pPr>
+      <w:rPr>
+        <w:rFonts w:ascii="Courier New" w:hAnsi="Courier New" w:hint="default"/>
+        <w:sz w:val="20"/>
+      </w:rPr>
+    </w:lvl>
+    <w:lvl w:ilvl="2" w:tentative="1">
+      <w:start w:val="1"/>
+      <w:numFmt w:val="bullet"/>
+      <w:lvlText w:val=""/>
+      <w:lvlJc w:val="left"/>
+      <w:pPr>
+        <w:tabs>
+          <w:tab w:val="num" w:pos="2160"/>
+        </w:tabs>
+        <w:ind w:left="2160" w:hanging="360"/>
+      </w:pPr>
+      <w:rPr>
+        <w:rFonts w:ascii="Wingdings" w:hAnsi="Wingdings" w:hint="default"/>
+        <w:sz w:val="20"/>
+      </w:rPr>
+    </w:lvl>
+    <w:lvl w:ilvl="3" w:tentative="1">
+      <w:start w:val="1"/>
+      <w:numFmt w:val="bullet"/>
+      <w:lvlText w:val=""/>
+      <w:lvlJc w:val="left"/>
+      <w:pPr>
+        <w:tabs>
+          <w:tab w:val="num" w:pos="2880"/>
+        </w:tabs>
+        <w:ind w:left="2880" w:hanging="360"/>
+      </w:pPr>
+      <w:rPr>
+        <w:rFonts w:ascii="Wingdings" w:hAnsi="Wingdings" w:hint="default"/>
+        <w:sz w:val="20"/>
+      </w:rPr>
+    </w:lvl>
+    <w:lvl w:ilvl="4" w:tentative="1">
+      <w:start w:val="1"/>
+      <w:numFmt w:val="bullet"/>
+      <w:lvlText w:val=""/>
+      <w:lvlJc w:val="left"/>
+      <w:pPr>
+        <w:tabs>
+          <w:tab w:val="num" w:pos="3600"/>
+        </w:tabs>
+        <w:ind w:left="3600" w:hanging="360"/>
+      </w:pPr>
+      <w:rPr>
+        <w:rFonts w:ascii="Wingdings" w:hAnsi="Wingdings" w:hint="default"/>
+        <w:sz w:val="20"/>
+      </w:rPr>
+    </w:lvl>
+    <w:lvl w:ilvl="5" w:tentative="1">
+      <w:start w:val="1"/>
+      <w:numFmt w:val="bullet"/>
+      <w:lvlText w:val=""/>
+      <w:lvlJc w:val="left"/>
+      <w:pPr>
+        <w:tabs>
+          <w:tab w:val="num" w:pos="4320"/>
+        </w:tabs>
+        <w:ind w:left="4320" w:hanging="360"/>
+      </w:pPr>
+      <w:rPr>
+        <w:rFonts w:ascii="Wingdings" w:hAnsi="Wingdings" w:hint="default"/>
+        <w:sz w:val="20"/>
+      </w:rPr>
+    </w:lvl>
+    <w:lvl w:ilvl="6" w:tentative="1">
+      <w:start w:val="1"/>
+      <w:numFmt w:val="bullet"/>
+      <w:lvlText w:val=""/>
+      <w:lvlJc w:val="left"/>
+      <w:pPr>
+        <w:tabs>
+          <w:tab w:val="num" w:pos="5040"/>
+        </w:tabs>
+        <w:ind w:left="5040" w:hanging="360"/>
+      </w:pPr>
+      <w:rPr>
+        <w:rFonts w:ascii="Wingdings" w:hAnsi="Wingdings" w:hint="default"/>
+        <w:sz w:val="20"/>
+      </w:rPr>
+    </w:lvl>
+    <w:lvl w:ilvl="7" w:tentative="1">
+      <w:start w:val="1"/>
+      <w:numFmt w:val="bullet"/>
+      <w:lvlText w:val=""/>
+      <w:lvlJc w:val="left"/>
+      <w:pPr>
+        <w:tabs>
+          <w:tab w:val="num" w:pos="5760"/>
+        </w:tabs>
+        <w:ind w:left="5760" w:hanging="360"/>
+      </w:pPr>
+      <w:rPr>
+        <w:rFonts w:ascii="Wingdings" w:hAnsi="Wingdings" w:hint="default"/>
+        <w:sz w:val="20"/>
+      </w:rPr>
+    </w:lvl>
+    <w:lvl w:ilvl="8" w:tentative="1">
+      <w:start w:val="1"/>
+      <w:numFmt w:val="bullet"/>
+      <w:lvlText w:val=""/>
+      <w:lvlJc w:val="left"/>
+      <w:pPr>
+        <w:tabs>
+          <w:tab w:val="num" w:pos="6480"/>
+        </w:tabs>
+        <w:ind w:left="6480" w:hanging="360"/>
+      </w:pPr>
+      <w:rPr>
+        <w:rFonts w:ascii="Wingdings" w:hAnsi="Wingdings" w:hint="default"/>
+        <w:sz w:val="20"/>
+      </w:rPr>
+    </w:lvl>
+  </w:abstractNum>
+  <w:abstractNum w:abstractNumId="21" w15:restartNumberingAfterBreak="0">
     <w:nsid w:val="378702AD"/>
     <w:multiLevelType w:val="multilevel"/>
     <w:tmpl w:val="AF7490AC"/>
@@ -25171,7 +27486,7 @@
       </w:rPr>
     </w:lvl>
   </w:abstractNum>
-  <w:abstractNum w:abstractNumId="20" w15:restartNumberingAfterBreak="0">
+  <w:abstractNum w:abstractNumId="22" w15:restartNumberingAfterBreak="0">
     <w:nsid w:val="38571B13"/>
     <w:multiLevelType w:val="multilevel"/>
     <w:tmpl w:val="BECC2EAE"/>
@@ -25320,7 +27635,7 @@
       </w:rPr>
     </w:lvl>
   </w:abstractNum>
-  <w:abstractNum w:abstractNumId="21" w15:restartNumberingAfterBreak="0">
+  <w:abstractNum w:abstractNumId="23" w15:restartNumberingAfterBreak="0">
     <w:nsid w:val="3C21772C"/>
     <w:multiLevelType w:val="multilevel"/>
     <w:tmpl w:val="6BD2F134"/>
@@ -25469,7 +27784,7 @@
       </w:rPr>
     </w:lvl>
   </w:abstractNum>
-  <w:abstractNum w:abstractNumId="22" w15:restartNumberingAfterBreak="0">
+  <w:abstractNum w:abstractNumId="24" w15:restartNumberingAfterBreak="0">
     <w:nsid w:val="3E521F75"/>
     <w:multiLevelType w:val="multilevel"/>
     <w:tmpl w:val="1C66E850"/>
@@ -25618,7 +27933,7 @@
       </w:rPr>
     </w:lvl>
   </w:abstractNum>
-  <w:abstractNum w:abstractNumId="23" w15:restartNumberingAfterBreak="0">
+  <w:abstractNum w:abstractNumId="25" w15:restartNumberingAfterBreak="0">
     <w:nsid w:val="406109DF"/>
     <w:multiLevelType w:val="multilevel"/>
     <w:tmpl w:val="D1428254"/>
@@ -25767,7 +28082,7 @@
       </w:rPr>
     </w:lvl>
   </w:abstractNum>
-  <w:abstractNum w:abstractNumId="24" w15:restartNumberingAfterBreak="0">
+  <w:abstractNum w:abstractNumId="26" w15:restartNumberingAfterBreak="0">
     <w:nsid w:val="431A061C"/>
     <w:multiLevelType w:val="multilevel"/>
     <w:tmpl w:val="FCD4F3D2"/>
@@ -25916,7 +28231,7 @@
       </w:rPr>
     </w:lvl>
   </w:abstractNum>
-  <w:abstractNum w:abstractNumId="25" w15:restartNumberingAfterBreak="0">
+  <w:abstractNum w:abstractNumId="27" w15:restartNumberingAfterBreak="0">
     <w:nsid w:val="435C6DF6"/>
     <w:multiLevelType w:val="multilevel"/>
     <w:tmpl w:val="80C0AC9E"/>
@@ -26065,7 +28380,7 @@
       </w:rPr>
     </w:lvl>
   </w:abstractNum>
-  <w:abstractNum w:abstractNumId="26" w15:restartNumberingAfterBreak="0">
+  <w:abstractNum w:abstractNumId="28" w15:restartNumberingAfterBreak="0">
     <w:nsid w:val="471C37CC"/>
     <w:multiLevelType w:val="multilevel"/>
     <w:tmpl w:val="79A8AB94"/>
@@ -26178,7 +28493,7 @@
       </w:pPr>
     </w:lvl>
   </w:abstractNum>
-  <w:abstractNum w:abstractNumId="27" w15:restartNumberingAfterBreak="0">
+  <w:abstractNum w:abstractNumId="29" w15:restartNumberingAfterBreak="0">
     <w:nsid w:val="47F71B58"/>
     <w:multiLevelType w:val="multilevel"/>
     <w:tmpl w:val="78D4D724"/>
@@ -26327,7 +28642,7 @@
       </w:rPr>
     </w:lvl>
   </w:abstractNum>
-  <w:abstractNum w:abstractNumId="28" w15:restartNumberingAfterBreak="0">
+  <w:abstractNum w:abstractNumId="30" w15:restartNumberingAfterBreak="0">
     <w:nsid w:val="48FD63B1"/>
     <w:multiLevelType w:val="multilevel"/>
     <w:tmpl w:val="A790D6BC"/>
@@ -26476,7 +28791,7 @@
       </w:rPr>
     </w:lvl>
   </w:abstractNum>
-  <w:abstractNum w:abstractNumId="29" w15:restartNumberingAfterBreak="0">
+  <w:abstractNum w:abstractNumId="31" w15:restartNumberingAfterBreak="0">
     <w:nsid w:val="49A03343"/>
     <w:multiLevelType w:val="multilevel"/>
     <w:tmpl w:val="A1E09AE6"/>
@@ -26625,7 +28940,7 @@
       </w:rPr>
     </w:lvl>
   </w:abstractNum>
-  <w:abstractNum w:abstractNumId="30" w15:restartNumberingAfterBreak="0">
+  <w:abstractNum w:abstractNumId="32" w15:restartNumberingAfterBreak="0">
     <w:nsid w:val="4A6E13A9"/>
     <w:multiLevelType w:val="multilevel"/>
     <w:tmpl w:val="D0A84B38"/>
@@ -26774,7 +29089,7 @@
       </w:rPr>
     </w:lvl>
   </w:abstractNum>
-  <w:abstractNum w:abstractNumId="31" w15:restartNumberingAfterBreak="0">
+  <w:abstractNum w:abstractNumId="33" w15:restartNumberingAfterBreak="0">
     <w:nsid w:val="4B2466E4"/>
     <w:multiLevelType w:val="multilevel"/>
     <w:tmpl w:val="022E11FC"/>
@@ -26923,7 +29238,7 @@
       </w:rPr>
     </w:lvl>
   </w:abstractNum>
-  <w:abstractNum w:abstractNumId="32" w15:restartNumberingAfterBreak="0">
+  <w:abstractNum w:abstractNumId="34" w15:restartNumberingAfterBreak="0">
     <w:nsid w:val="4E9039A1"/>
     <w:multiLevelType w:val="multilevel"/>
     <w:tmpl w:val="10364C88"/>
@@ -27072,7 +29387,7 @@
       </w:rPr>
     </w:lvl>
   </w:abstractNum>
-  <w:abstractNum w:abstractNumId="33" w15:restartNumberingAfterBreak="0">
+  <w:abstractNum w:abstractNumId="35" w15:restartNumberingAfterBreak="0">
     <w:nsid w:val="4F180F3C"/>
     <w:multiLevelType w:val="multilevel"/>
     <w:tmpl w:val="2266E58C"/>
@@ -27221,7 +29536,7 @@
       </w:rPr>
     </w:lvl>
   </w:abstractNum>
-  <w:abstractNum w:abstractNumId="34" w15:restartNumberingAfterBreak="0">
+  <w:abstractNum w:abstractNumId="36" w15:restartNumberingAfterBreak="0">
     <w:nsid w:val="505523D4"/>
     <w:multiLevelType w:val="multilevel"/>
     <w:tmpl w:val="44CE1AB0"/>
@@ -27370,7 +29685,7 @@
       </w:rPr>
     </w:lvl>
   </w:abstractNum>
-  <w:abstractNum w:abstractNumId="35" w15:restartNumberingAfterBreak="0">
+  <w:abstractNum w:abstractNumId="37" w15:restartNumberingAfterBreak="0">
     <w:nsid w:val="52112A88"/>
     <w:multiLevelType w:val="multilevel"/>
     <w:tmpl w:val="C75CC440"/>
@@ -27519,7 +29834,7 @@
       </w:rPr>
     </w:lvl>
   </w:abstractNum>
-  <w:abstractNum w:abstractNumId="36" w15:restartNumberingAfterBreak="0">
+  <w:abstractNum w:abstractNumId="38" w15:restartNumberingAfterBreak="0">
     <w:nsid w:val="5404707C"/>
     <w:multiLevelType w:val="multilevel"/>
     <w:tmpl w:val="36281D12"/>
@@ -27632,7 +29947,7 @@
       </w:pPr>
     </w:lvl>
   </w:abstractNum>
-  <w:abstractNum w:abstractNumId="37" w15:restartNumberingAfterBreak="0">
+  <w:abstractNum w:abstractNumId="39" w15:restartNumberingAfterBreak="0">
     <w:nsid w:val="562803B5"/>
     <w:multiLevelType w:val="multilevel"/>
     <w:tmpl w:val="DEEE1170"/>
@@ -27745,7 +30060,7 @@
       </w:pPr>
     </w:lvl>
   </w:abstractNum>
-  <w:abstractNum w:abstractNumId="38" w15:restartNumberingAfterBreak="0">
+  <w:abstractNum w:abstractNumId="40" w15:restartNumberingAfterBreak="0">
     <w:nsid w:val="5646073B"/>
     <w:multiLevelType w:val="multilevel"/>
     <w:tmpl w:val="FFD0913A"/>
@@ -27894,7 +30209,7 @@
       </w:rPr>
     </w:lvl>
   </w:abstractNum>
-  <w:abstractNum w:abstractNumId="39" w15:restartNumberingAfterBreak="0">
+  <w:abstractNum w:abstractNumId="41" w15:restartNumberingAfterBreak="0">
     <w:nsid w:val="5771548D"/>
     <w:multiLevelType w:val="multilevel"/>
     <w:tmpl w:val="C0E80718"/>
@@ -28043,7 +30358,7 @@
       </w:rPr>
     </w:lvl>
   </w:abstractNum>
-  <w:abstractNum w:abstractNumId="40" w15:restartNumberingAfterBreak="0">
+  <w:abstractNum w:abstractNumId="42" w15:restartNumberingAfterBreak="0">
     <w:nsid w:val="5D4E4658"/>
     <w:multiLevelType w:val="multilevel"/>
     <w:tmpl w:val="A0C8A972"/>
@@ -28192,7 +30507,7 @@
       </w:rPr>
     </w:lvl>
   </w:abstractNum>
-  <w:abstractNum w:abstractNumId="41" w15:restartNumberingAfterBreak="0">
+  <w:abstractNum w:abstractNumId="43" w15:restartNumberingAfterBreak="0">
     <w:nsid w:val="5D607DDB"/>
     <w:multiLevelType w:val="multilevel"/>
     <w:tmpl w:val="FD2AECA2"/>
@@ -28341,7 +30656,7 @@
       </w:rPr>
     </w:lvl>
   </w:abstractNum>
-  <w:abstractNum w:abstractNumId="42" w15:restartNumberingAfterBreak="0">
+  <w:abstractNum w:abstractNumId="44" w15:restartNumberingAfterBreak="0">
     <w:nsid w:val="5DE56A18"/>
     <w:multiLevelType w:val="multilevel"/>
     <w:tmpl w:val="DBCA7D40"/>
@@ -28490,7 +30805,7 @@
       </w:rPr>
     </w:lvl>
   </w:abstractNum>
-  <w:abstractNum w:abstractNumId="43" w15:restartNumberingAfterBreak="0">
+  <w:abstractNum w:abstractNumId="45" w15:restartNumberingAfterBreak="0">
     <w:nsid w:val="5DFE22E3"/>
     <w:multiLevelType w:val="multilevel"/>
     <w:tmpl w:val="19F04BC2"/>
@@ -28639,7 +30954,7 @@
       </w:rPr>
     </w:lvl>
   </w:abstractNum>
-  <w:abstractNum w:abstractNumId="44" w15:restartNumberingAfterBreak="0">
+  <w:abstractNum w:abstractNumId="46" w15:restartNumberingAfterBreak="0">
     <w:nsid w:val="5EE53F01"/>
     <w:multiLevelType w:val="multilevel"/>
     <w:tmpl w:val="86BE99B4"/>
@@ -28788,7 +31103,7 @@
       </w:rPr>
     </w:lvl>
   </w:abstractNum>
-  <w:abstractNum w:abstractNumId="45" w15:restartNumberingAfterBreak="0">
+  <w:abstractNum w:abstractNumId="47" w15:restartNumberingAfterBreak="0">
     <w:nsid w:val="5F3B26E3"/>
     <w:multiLevelType w:val="multilevel"/>
     <w:tmpl w:val="014057A2"/>
@@ -28901,7 +31216,7 @@
       </w:pPr>
     </w:lvl>
   </w:abstractNum>
-  <w:abstractNum w:abstractNumId="46" w15:restartNumberingAfterBreak="0">
+  <w:abstractNum w:abstractNumId="48" w15:restartNumberingAfterBreak="0">
     <w:nsid w:val="619C611D"/>
     <w:multiLevelType w:val="hybridMultilevel"/>
     <w:tmpl w:val="87E2598A"/>
@@ -28992,7 +31307,7 @@
       </w:pPr>
     </w:lvl>
   </w:abstractNum>
-  <w:abstractNum w:abstractNumId="47" w15:restartNumberingAfterBreak="0">
+  <w:abstractNum w:abstractNumId="49" w15:restartNumberingAfterBreak="0">
     <w:nsid w:val="62052CBE"/>
     <w:multiLevelType w:val="multilevel"/>
     <w:tmpl w:val="843C9900"/>
@@ -29141,7 +31456,7 @@
       </w:rPr>
     </w:lvl>
   </w:abstractNum>
-  <w:abstractNum w:abstractNumId="48" w15:restartNumberingAfterBreak="0">
+  <w:abstractNum w:abstractNumId="50" w15:restartNumberingAfterBreak="0">
     <w:nsid w:val="647F190B"/>
     <w:multiLevelType w:val="multilevel"/>
     <w:tmpl w:val="FAB6DF6C"/>
@@ -29254,7 +31569,7 @@
       </w:pPr>
     </w:lvl>
   </w:abstractNum>
-  <w:abstractNum w:abstractNumId="49" w15:restartNumberingAfterBreak="0">
+  <w:abstractNum w:abstractNumId="51" w15:restartNumberingAfterBreak="0">
     <w:nsid w:val="6EBE30B3"/>
     <w:multiLevelType w:val="multilevel"/>
     <w:tmpl w:val="223A7E96"/>
@@ -29403,7 +31718,156 @@
       </w:rPr>
     </w:lvl>
   </w:abstractNum>
-  <w:abstractNum w:abstractNumId="50" w15:restartNumberingAfterBreak="0">
+  <w:abstractNum w:abstractNumId="52" w15:restartNumberingAfterBreak="0">
+    <w:nsid w:val="6FFC5EC4"/>
+    <w:multiLevelType w:val="multilevel"/>
+    <w:tmpl w:val="557C0826"/>
+    <w:lvl w:ilvl="0">
+      <w:start w:val="1"/>
+      <w:numFmt w:val="bullet"/>
+      <w:lvlText w:val=""/>
+      <w:lvlJc w:val="left"/>
+      <w:pPr>
+        <w:tabs>
+          <w:tab w:val="num" w:pos="720"/>
+        </w:tabs>
+        <w:ind w:left="720" w:hanging="360"/>
+      </w:pPr>
+      <w:rPr>
+        <w:rFonts w:ascii="Symbol" w:hAnsi="Symbol" w:hint="default"/>
+        <w:sz w:val="20"/>
+      </w:rPr>
+    </w:lvl>
+    <w:lvl w:ilvl="1" w:tentative="1">
+      <w:start w:val="1"/>
+      <w:numFmt w:val="bullet"/>
+      <w:lvlText w:val="o"/>
+      <w:lvlJc w:val="left"/>
+      <w:pPr>
+        <w:tabs>
+          <w:tab w:val="num" w:pos="1440"/>
+        </w:tabs>
+        <w:ind w:left="1440" w:hanging="360"/>
+      </w:pPr>
+      <w:rPr>
+        <w:rFonts w:ascii="Courier New" w:hAnsi="Courier New" w:hint="default"/>
+        <w:sz w:val="20"/>
+      </w:rPr>
+    </w:lvl>
+    <w:lvl w:ilvl="2" w:tentative="1">
+      <w:start w:val="1"/>
+      <w:numFmt w:val="bullet"/>
+      <w:lvlText w:val=""/>
+      <w:lvlJc w:val="left"/>
+      <w:pPr>
+        <w:tabs>
+          <w:tab w:val="num" w:pos="2160"/>
+        </w:tabs>
+        <w:ind w:left="2160" w:hanging="360"/>
+      </w:pPr>
+      <w:rPr>
+        <w:rFonts w:ascii="Wingdings" w:hAnsi="Wingdings" w:hint="default"/>
+        <w:sz w:val="20"/>
+      </w:rPr>
+    </w:lvl>
+    <w:lvl w:ilvl="3" w:tentative="1">
+      <w:start w:val="1"/>
+      <w:numFmt w:val="bullet"/>
+      <w:lvlText w:val=""/>
+      <w:lvlJc w:val="left"/>
+      <w:pPr>
+        <w:tabs>
+          <w:tab w:val="num" w:pos="2880"/>
+        </w:tabs>
+        <w:ind w:left="2880" w:hanging="360"/>
+      </w:pPr>
+      <w:rPr>
+        <w:rFonts w:ascii="Wingdings" w:hAnsi="Wingdings" w:hint="default"/>
+        <w:sz w:val="20"/>
+      </w:rPr>
+    </w:lvl>
+    <w:lvl w:ilvl="4" w:tentative="1">
+      <w:start w:val="1"/>
+      <w:numFmt w:val="bullet"/>
+      <w:lvlText w:val=""/>
+      <w:lvlJc w:val="left"/>
+      <w:pPr>
+        <w:tabs>
+          <w:tab w:val="num" w:pos="3600"/>
+        </w:tabs>
+        <w:ind w:left="3600" w:hanging="360"/>
+      </w:pPr>
+      <w:rPr>
+        <w:rFonts w:ascii="Wingdings" w:hAnsi="Wingdings" w:hint="default"/>
+        <w:sz w:val="20"/>
+      </w:rPr>
+    </w:lvl>
+    <w:lvl w:ilvl="5" w:tentative="1">
+      <w:start w:val="1"/>
+      <w:numFmt w:val="bullet"/>
+      <w:lvlText w:val=""/>
+      <w:lvlJc w:val="left"/>
+      <w:pPr>
+        <w:tabs>
+          <w:tab w:val="num" w:pos="4320"/>
+        </w:tabs>
+        <w:ind w:left="4320" w:hanging="360"/>
+      </w:pPr>
+      <w:rPr>
+        <w:rFonts w:ascii="Wingdings" w:hAnsi="Wingdings" w:hint="default"/>
+        <w:sz w:val="20"/>
+      </w:rPr>
+    </w:lvl>
+    <w:lvl w:ilvl="6" w:tentative="1">
+      <w:start w:val="1"/>
+      <w:numFmt w:val="bullet"/>
+      <w:lvlText w:val=""/>
+      <w:lvlJc w:val="left"/>
+      <w:pPr>
+        <w:tabs>
+          <w:tab w:val="num" w:pos="5040"/>
+        </w:tabs>
+        <w:ind w:left="5040" w:hanging="360"/>
+      </w:pPr>
+      <w:rPr>
+        <w:rFonts w:ascii="Wingdings" w:hAnsi="Wingdings" w:hint="default"/>
+        <w:sz w:val="20"/>
+      </w:rPr>
+    </w:lvl>
+    <w:lvl w:ilvl="7" w:tentative="1">
+      <w:start w:val="1"/>
+      <w:numFmt w:val="bullet"/>
+      <w:lvlText w:val=""/>
+      <w:lvlJc w:val="left"/>
+      <w:pPr>
+        <w:tabs>
+          <w:tab w:val="num" w:pos="5760"/>
+        </w:tabs>
+        <w:ind w:left="5760" w:hanging="360"/>
+      </w:pPr>
+      <w:rPr>
+        <w:rFonts w:ascii="Wingdings" w:hAnsi="Wingdings" w:hint="default"/>
+        <w:sz w:val="20"/>
+      </w:rPr>
+    </w:lvl>
+    <w:lvl w:ilvl="8" w:tentative="1">
+      <w:start w:val="1"/>
+      <w:numFmt w:val="bullet"/>
+      <w:lvlText w:val=""/>
+      <w:lvlJc w:val="left"/>
+      <w:pPr>
+        <w:tabs>
+          <w:tab w:val="num" w:pos="6480"/>
+        </w:tabs>
+        <w:ind w:left="6480" w:hanging="360"/>
+      </w:pPr>
+      <w:rPr>
+        <w:rFonts w:ascii="Wingdings" w:hAnsi="Wingdings" w:hint="default"/>
+        <w:sz w:val="20"/>
+      </w:rPr>
+    </w:lvl>
+  </w:abstractNum>
+  <w:abstractNum w:abstractNumId="53" w15:restartNumberingAfterBreak="0">
     <w:nsid w:val="72DA6B13"/>
     <w:multiLevelType w:val="multilevel"/>
     <w:tmpl w:val="E6A61122"/>
@@ -29552,7 +32016,120 @@
       </w:rPr>
     </w:lvl>
   </w:abstractNum>
-  <w:abstractNum w:abstractNumId="51" w15:restartNumberingAfterBreak="0">
+  <w:abstractNum w:abstractNumId="54" w15:restartNumberingAfterBreak="0">
+    <w:nsid w:val="732C2DBC"/>
+    <w:multiLevelType w:val="multilevel"/>
+    <w:tmpl w:val="7EB2DC30"/>
+    <w:lvl w:ilvl="0">
+      <w:start w:val="1"/>
+      <w:numFmt w:val="decimal"/>
+      <w:lvlText w:val="%1."/>
+      <w:lvlJc w:val="left"/>
+      <w:pPr>
+        <w:tabs>
+          <w:tab w:val="num" w:pos="720"/>
+        </w:tabs>
+        <w:ind w:left="720" w:hanging="360"/>
+      </w:pPr>
+    </w:lvl>
+    <w:lvl w:ilvl="1" w:tentative="1">
+      <w:start w:val="1"/>
+      <w:numFmt w:val="decimal"/>
+      <w:lvlText w:val="%2."/>
+      <w:lvlJc w:val="left"/>
+      <w:pPr>
+        <w:tabs>
+          <w:tab w:val="num" w:pos="1440"/>
+        </w:tabs>
+        <w:ind w:left="1440" w:hanging="360"/>
+      </w:pPr>
+    </w:lvl>
+    <w:lvl w:ilvl="2" w:tentative="1">
+      <w:start w:val="1"/>
+      <w:numFmt w:val="decimal"/>
+      <w:lvlText w:val="%3."/>
+      <w:lvlJc w:val="left"/>
+      <w:pPr>
+        <w:tabs>
+          <w:tab w:val="num" w:pos="2160"/>
+        </w:tabs>
+        <w:ind w:left="2160" w:hanging="360"/>
+      </w:pPr>
+    </w:lvl>
+    <w:lvl w:ilvl="3" w:tentative="1">
+      <w:start w:val="1"/>
+      <w:numFmt w:val="decimal"/>
+      <w:lvlText w:val="%4."/>
+      <w:lvlJc w:val="left"/>
+      <w:pPr>
+        <w:tabs>
+          <w:tab w:val="num" w:pos="2880"/>
+        </w:tabs>
+        <w:ind w:left="2880" w:hanging="360"/>
+      </w:pPr>
+    </w:lvl>
+    <w:lvl w:ilvl="4" w:tentative="1">
+      <w:start w:val="1"/>
+      <w:numFmt w:val="decimal"/>
+      <w:lvlText w:val="%5."/>
+      <w:lvlJc w:val="left"/>
+      <w:pPr>
+        <w:tabs>
+          <w:tab w:val="num" w:pos="3600"/>
+        </w:tabs>
+        <w:ind w:left="3600" w:hanging="360"/>
+      </w:pPr>
+    </w:lvl>
+    <w:lvl w:ilvl="5" w:tentative="1">
+      <w:start w:val="1"/>
+      <w:numFmt w:val="decimal"/>
+      <w:lvlText w:val="%6."/>
+      <w:lvlJc w:val="left"/>
+      <w:pPr>
+        <w:tabs>
+          <w:tab w:val="num" w:pos="4320"/>
+        </w:tabs>
+        <w:ind w:left="4320" w:hanging="360"/>
+      </w:pPr>
+    </w:lvl>
+    <w:lvl w:ilvl="6" w:tentative="1">
+      <w:start w:val="1"/>
+      <w:numFmt w:val="decimal"/>
+      <w:lvlText w:val="%7."/>
+      <w:lvlJc w:val="left"/>
+      <w:pPr>
+        <w:tabs>
+          <w:tab w:val="num" w:pos="5040"/>
+        </w:tabs>
+        <w:ind w:left="5040" w:hanging="360"/>
+      </w:pPr>
+    </w:lvl>
+    <w:lvl w:ilvl="7" w:tentative="1">
+      <w:start w:val="1"/>
+      <w:numFmt w:val="decimal"/>
+      <w:lvlText w:val="%8."/>
+      <w:lvlJc w:val="left"/>
+      <w:pPr>
+        <w:tabs>
+          <w:tab w:val="num" w:pos="5760"/>
+        </w:tabs>
+        <w:ind w:left="5760" w:hanging="360"/>
+      </w:pPr>
+    </w:lvl>
+    <w:lvl w:ilvl="8" w:tentative="1">
+      <w:start w:val="1"/>
+      <w:numFmt w:val="decimal"/>
+      <w:lvlText w:val="%9."/>
+      <w:lvlJc w:val="left"/>
+      <w:pPr>
+        <w:tabs>
+          <w:tab w:val="num" w:pos="6480"/>
+        </w:tabs>
+        <w:ind w:left="6480" w:hanging="360"/>
+      </w:pPr>
+    </w:lvl>
+  </w:abstractNum>
+  <w:abstractNum w:abstractNumId="55" w15:restartNumberingAfterBreak="0">
     <w:nsid w:val="74860495"/>
     <w:multiLevelType w:val="multilevel"/>
     <w:tmpl w:val="D210669E"/>
@@ -29701,7 +32278,7 @@
       </w:rPr>
     </w:lvl>
   </w:abstractNum>
-  <w:abstractNum w:abstractNumId="52" w15:restartNumberingAfterBreak="0">
+  <w:abstractNum w:abstractNumId="56" w15:restartNumberingAfterBreak="0">
     <w:nsid w:val="75033682"/>
     <w:multiLevelType w:val="hybridMultilevel"/>
     <w:tmpl w:val="8A3EDE08"/>
@@ -29814,7 +32391,7 @@
       </w:rPr>
     </w:lvl>
   </w:abstractNum>
-  <w:abstractNum w:abstractNumId="53" w15:restartNumberingAfterBreak="0">
+  <w:abstractNum w:abstractNumId="57" w15:restartNumberingAfterBreak="0">
     <w:nsid w:val="7AD81150"/>
     <w:multiLevelType w:val="multilevel"/>
     <w:tmpl w:val="B69AA216"/>
@@ -29927,7 +32504,7 @@
       </w:pPr>
     </w:lvl>
   </w:abstractNum>
-  <w:abstractNum w:abstractNumId="54" w15:restartNumberingAfterBreak="0">
+  <w:abstractNum w:abstractNumId="58" w15:restartNumberingAfterBreak="0">
     <w:nsid w:val="7CAD455B"/>
     <w:multiLevelType w:val="multilevel"/>
     <w:tmpl w:val="F0860F38"/>
@@ -30076,7 +32653,7 @@
       </w:rPr>
     </w:lvl>
   </w:abstractNum>
-  <w:abstractNum w:abstractNumId="55" w15:restartNumberingAfterBreak="0">
+  <w:abstractNum w:abstractNumId="59" w15:restartNumberingAfterBreak="0">
     <w:nsid w:val="7DD9430E"/>
     <w:multiLevelType w:val="multilevel"/>
     <w:tmpl w:val="6A9AF7A8"/>
@@ -30229,25 +32806,25 @@
     <w:abstractNumId w:val="2"/>
   </w:num>
   <w:num w:numId="2" w16cid:durableId="827327439">
-    <w:abstractNumId w:val="18"/>
+    <w:abstractNumId w:val="19"/>
   </w:num>
   <w:num w:numId="3" w16cid:durableId="1215576940">
-    <w:abstractNumId w:val="42"/>
+    <w:abstractNumId w:val="44"/>
   </w:num>
   <w:num w:numId="4" w16cid:durableId="347676372">
+    <w:abstractNumId w:val="36"/>
+  </w:num>
+  <w:num w:numId="5" w16cid:durableId="313799300">
+    <w:abstractNumId w:val="55"/>
+  </w:num>
+  <w:num w:numId="6" w16cid:durableId="1588340423">
+    <w:abstractNumId w:val="11"/>
+  </w:num>
+  <w:num w:numId="7" w16cid:durableId="837502277">
     <w:abstractNumId w:val="34"/>
   </w:num>
-  <w:num w:numId="5" w16cid:durableId="313799300">
-    <w:abstractNumId w:val="51"/>
-  </w:num>
-  <w:num w:numId="6" w16cid:durableId="1588340423">
-    <w:abstractNumId w:val="10"/>
-  </w:num>
-  <w:num w:numId="7" w16cid:durableId="837502277">
-    <w:abstractNumId w:val="32"/>
-  </w:num>
   <w:num w:numId="8" w16cid:durableId="1386635393">
-    <w:abstractNumId w:val="52"/>
+    <w:abstractNumId w:val="56"/>
   </w:num>
   <w:num w:numId="9" w16cid:durableId="1840928803">
     <w:abstractNumId w:val="7"/>
@@ -30256,22 +32833,22 @@
     <w:abstractNumId w:val="4"/>
   </w:num>
   <w:num w:numId="11" w16cid:durableId="1908757973">
-    <w:abstractNumId w:val="22"/>
+    <w:abstractNumId w:val="24"/>
   </w:num>
   <w:num w:numId="12" w16cid:durableId="1942377769">
-    <w:abstractNumId w:val="12"/>
+    <w:abstractNumId w:val="13"/>
   </w:num>
   <w:num w:numId="13" w16cid:durableId="18049411">
-    <w:abstractNumId w:val="47"/>
+    <w:abstractNumId w:val="49"/>
   </w:num>
   <w:num w:numId="14" w16cid:durableId="342050096">
     <w:abstractNumId w:val="5"/>
   </w:num>
   <w:num w:numId="15" w16cid:durableId="1865482450">
-    <w:abstractNumId w:val="15"/>
+    <w:abstractNumId w:val="16"/>
   </w:num>
   <w:num w:numId="16" w16cid:durableId="1583101855">
-    <w:abstractNumId w:val="41"/>
+    <w:abstractNumId w:val="43"/>
   </w:num>
   <w:num w:numId="17" w16cid:durableId="186065224">
     <w:abstractNumId w:val="3"/>
@@ -30280,120 +32857,132 @@
     <w:abstractNumId w:val="1"/>
   </w:num>
   <w:num w:numId="19" w16cid:durableId="970286085">
-    <w:abstractNumId w:val="35"/>
+    <w:abstractNumId w:val="37"/>
   </w:num>
   <w:num w:numId="20" w16cid:durableId="1860123217">
+    <w:abstractNumId w:val="50"/>
+  </w:num>
+  <w:num w:numId="21" w16cid:durableId="216554242">
+    <w:abstractNumId w:val="46"/>
+  </w:num>
+  <w:num w:numId="22" w16cid:durableId="511265077">
     <w:abstractNumId w:val="48"/>
   </w:num>
-  <w:num w:numId="21" w16cid:durableId="216554242">
-    <w:abstractNumId w:val="44"/>
-  </w:num>
-  <w:num w:numId="22" w16cid:durableId="511265077">
-    <w:abstractNumId w:val="46"/>
-  </w:num>
   <w:num w:numId="23" w16cid:durableId="1603225819">
-    <w:abstractNumId w:val="36"/>
+    <w:abstractNumId w:val="38"/>
   </w:num>
   <w:num w:numId="24" w16cid:durableId="1424766193">
+    <w:abstractNumId w:val="18"/>
+  </w:num>
+  <w:num w:numId="25" w16cid:durableId="284778662">
+    <w:abstractNumId w:val="23"/>
+  </w:num>
+  <w:num w:numId="26" w16cid:durableId="744688999">
+    <w:abstractNumId w:val="10"/>
+  </w:num>
+  <w:num w:numId="27" w16cid:durableId="922567680">
+    <w:abstractNumId w:val="41"/>
+  </w:num>
+  <w:num w:numId="28" w16cid:durableId="1096167267">
+    <w:abstractNumId w:val="53"/>
+  </w:num>
+  <w:num w:numId="29" w16cid:durableId="1698971936">
+    <w:abstractNumId w:val="40"/>
+  </w:num>
+  <w:num w:numId="30" w16cid:durableId="1505897299">
     <w:abstractNumId w:val="17"/>
   </w:num>
-  <w:num w:numId="25" w16cid:durableId="284778662">
+  <w:num w:numId="31" w16cid:durableId="80878394">
+    <w:abstractNumId w:val="31"/>
+  </w:num>
+  <w:num w:numId="32" w16cid:durableId="1185751540">
     <w:abstractNumId w:val="21"/>
   </w:num>
-  <w:num w:numId="26" w16cid:durableId="744688999">
-    <w:abstractNumId w:val="9"/>
-  </w:num>
-  <w:num w:numId="27" w16cid:durableId="922567680">
-    <w:abstractNumId w:val="39"/>
-  </w:num>
-  <w:num w:numId="28" w16cid:durableId="1096167267">
-    <w:abstractNumId w:val="50"/>
-  </w:num>
-  <w:num w:numId="29" w16cid:durableId="1698971936">
-    <w:abstractNumId w:val="38"/>
-  </w:num>
-  <w:num w:numId="30" w16cid:durableId="1505897299">
-    <w:abstractNumId w:val="16"/>
-  </w:num>
-  <w:num w:numId="31" w16cid:durableId="80878394">
-    <w:abstractNumId w:val="29"/>
-  </w:num>
-  <w:num w:numId="32" w16cid:durableId="1185751540">
-    <w:abstractNumId w:val="19"/>
-  </w:num>
   <w:num w:numId="33" w16cid:durableId="2094274763">
-    <w:abstractNumId w:val="30"/>
+    <w:abstractNumId w:val="32"/>
   </w:num>
   <w:num w:numId="34" w16cid:durableId="849947892">
-    <w:abstractNumId w:val="31"/>
+    <w:abstractNumId w:val="33"/>
   </w:num>
   <w:num w:numId="35" w16cid:durableId="393090706">
-    <w:abstractNumId w:val="20"/>
+    <w:abstractNumId w:val="22"/>
   </w:num>
   <w:num w:numId="36" w16cid:durableId="1371418710">
-    <w:abstractNumId w:val="55"/>
+    <w:abstractNumId w:val="59"/>
   </w:num>
   <w:num w:numId="37" w16cid:durableId="10451662">
     <w:abstractNumId w:val="6"/>
   </w:num>
   <w:num w:numId="38" w16cid:durableId="1193298983">
-    <w:abstractNumId w:val="53"/>
+    <w:abstractNumId w:val="57"/>
   </w:num>
   <w:num w:numId="39" w16cid:durableId="719473330">
-    <w:abstractNumId w:val="23"/>
+    <w:abstractNumId w:val="25"/>
   </w:num>
   <w:num w:numId="40" w16cid:durableId="756440829">
     <w:abstractNumId w:val="0"/>
   </w:num>
   <w:num w:numId="41" w16cid:durableId="919025558">
+    <w:abstractNumId w:val="30"/>
+  </w:num>
+  <w:num w:numId="42" w16cid:durableId="1136485496">
+    <w:abstractNumId w:val="26"/>
+  </w:num>
+  <w:num w:numId="43" w16cid:durableId="261692912">
+    <w:abstractNumId w:val="42"/>
+  </w:num>
+  <w:num w:numId="44" w16cid:durableId="1898589247">
     <w:abstractNumId w:val="28"/>
   </w:num>
-  <w:num w:numId="42" w16cid:durableId="1136485496">
-    <w:abstractNumId w:val="24"/>
-  </w:num>
-  <w:num w:numId="43" w16cid:durableId="261692912">
-    <w:abstractNumId w:val="40"/>
-  </w:num>
-  <w:num w:numId="44" w16cid:durableId="1898589247">
-    <w:abstractNumId w:val="26"/>
-  </w:num>
   <w:num w:numId="45" w16cid:durableId="390348859">
-    <w:abstractNumId w:val="27"/>
+    <w:abstractNumId w:val="29"/>
   </w:num>
   <w:num w:numId="46" w16cid:durableId="1663776085">
-    <w:abstractNumId w:val="43"/>
+    <w:abstractNumId w:val="45"/>
   </w:num>
   <w:num w:numId="47" w16cid:durableId="1179345948">
     <w:abstractNumId w:val="8"/>
   </w:num>
   <w:num w:numId="48" w16cid:durableId="1296525377">
-    <w:abstractNumId w:val="13"/>
+    <w:abstractNumId w:val="14"/>
   </w:num>
   <w:num w:numId="49" w16cid:durableId="941034527">
-    <w:abstractNumId w:val="45"/>
+    <w:abstractNumId w:val="47"/>
   </w:num>
   <w:num w:numId="50" w16cid:durableId="794835237">
-    <w:abstractNumId w:val="11"/>
+    <w:abstractNumId w:val="12"/>
   </w:num>
   <w:num w:numId="51" w16cid:durableId="378558495">
+    <w:abstractNumId w:val="58"/>
+  </w:num>
+  <w:num w:numId="52" w16cid:durableId="693188969">
+    <w:abstractNumId w:val="39"/>
+  </w:num>
+  <w:num w:numId="53" w16cid:durableId="1607153650">
+    <w:abstractNumId w:val="35"/>
+  </w:num>
+  <w:num w:numId="54" w16cid:durableId="1493794001">
+    <w:abstractNumId w:val="27"/>
+  </w:num>
+  <w:num w:numId="55" w16cid:durableId="1807817408">
+    <w:abstractNumId w:val="15"/>
+  </w:num>
+  <w:num w:numId="56" w16cid:durableId="1704284547">
+    <w:abstractNumId w:val="51"/>
+  </w:num>
+  <w:num w:numId="57" w16cid:durableId="1638493567">
     <w:abstractNumId w:val="54"/>
   </w:num>
-  <w:num w:numId="52" w16cid:durableId="693188969">
-    <w:abstractNumId w:val="37"/>
+  <w:num w:numId="58" w16cid:durableId="1350525816">
+    <w:abstractNumId w:val="52"/>
   </w:num>
-  <w:num w:numId="53" w16cid:durableId="1607153650">
-    <w:abstractNumId w:val="33"/>
+  <w:num w:numId="59" w16cid:durableId="116073095">
+    <w:abstractNumId w:val="20"/>
   </w:num>
-  <w:num w:numId="54" w16cid:durableId="1493794001">
-    <w:abstractNumId w:val="25"/>
+  <w:num w:numId="60" w16cid:durableId="1438721380">
+    <w:abstractNumId w:val="9"/>
   </w:num>
-  <w:num w:numId="55" w16cid:durableId="1807817408">
-    <w:abstractNumId w:val="14"/>
-  </w:num>
-  <w:num w:numId="56" w16cid:durableId="1704284547">
-    <w:abstractNumId w:val="49"/>
-  </w:num>
-  <w:numIdMacAtCleanup w:val="56"/>
+  <w:numIdMacAtCleanup w:val="60"/>
 </w:numbering>
 </file>
 

</xml_diff>